<commit_message>
Guia del personal y go-no-go: si la familia no aparece en GES no se cobra ni se instala
Decision de Gerardo del 11-sep. La guia del personal ya no deja el caso en
blanco, y el go-no-go resuelve lo que hace la caja cuando el expediente no
trae los apellidos de la familia: busca en GES por el nombre del alumno, y
si no aparece no recibe el pago.
</commit_message>
<xml_diff>
--- a/Entregables/E8 - Manual y Capacitacion/E8 - Guia rapida del personal.docx
+++ b/Entregables/E8 - Manual y Capacitacion/E8 - Guia rapida del personal.docx
@@ -101,7 +101,7 @@
           <w:szCs w:val="20"/>
           <w:lang w:val="es-ES"/>
         </w:rPr>
-        <w:pict w14:anchorId="18E809D2">
+        <w:pict w14:anchorId="35A8664F">
           <v:rect id="_x0000_i1025" style="width:0;height:1.5pt" o:hralign="center" o:hrstd="t" o:hr="t" fillcolor="#a0a0a0" stroked="f"/>
         </w:pict>
       </w:r>
@@ -1555,7 +1555,7 @@
           <w:szCs w:val="20"/>
           <w:lang w:val="es-ES"/>
         </w:rPr>
-        <w:pict w14:anchorId="18CD73FD">
+        <w:pict w14:anchorId="1869B5D9">
           <v:rect id="_x0000_i1026" style="width:0;height:1.5pt" o:hralign="center" o:hrstd="t" o:hr="t" fillcolor="#a0a0a0" stroked="f"/>
         </w:pict>
       </w:r>
@@ -2240,13 +2240,33 @@
       </w:pPr>
       <w:r>
         <w:rPr>
-          <w:rFonts w:ascii="Segoe UI" w:eastAsia="Times New Roman" w:hAnsi="Segoe UI" w:cs="Segoe UI"/>
-          <w:color w:val="1C2333"/>
-          <w:sz w:val="20"/>
-          <w:szCs w:val="20"/>
-          <w:lang w:val="es-ES"/>
-        </w:rPr>
-        <w:t>Si la familia no aparece en GES: ____ (por definir)</w:t>
+          <w:rStyle w:val="Fuerte"/>
+          <w:rFonts w:ascii="Segoe UI" w:eastAsia="Times New Roman" w:hAnsi="Segoe UI" w:cs="Segoe UI"/>
+          <w:sz w:val="20"/>
+          <w:szCs w:val="20"/>
+          <w:lang w:val="es-ES"/>
+        </w:rPr>
+        <w:t>Si la familia no aparece en GES, no reciba el pago.</w:t>
+      </w:r>
+      <w:r>
+        <w:rPr>
+          <w:rFonts w:ascii="Segoe UI" w:eastAsia="Times New Roman" w:hAnsi="Segoe UI" w:cs="Segoe UI"/>
+          <w:color w:val="1C2333"/>
+          <w:sz w:val="20"/>
+          <w:szCs w:val="20"/>
+          <w:lang w:val="es-ES"/>
+        </w:rPr>
+        <w:t xml:space="preserve"> </w:t>
+      </w:r>
+      <w:r>
+        <w:rPr>
+          <w:rFonts w:ascii="Segoe UI" w:eastAsia="Times New Roman" w:hAnsi="Segoe UI" w:cs="Segoe UI"/>
+          <w:color w:val="1C2333"/>
+          <w:sz w:val="20"/>
+          <w:szCs w:val="20"/>
+          <w:lang w:val="es-ES"/>
+        </w:rPr>
+        <w:t>Sin pago no se instala el TAG.</w:t>
       </w:r>
     </w:p>
     <w:p>
@@ -2780,7 +2800,7 @@
           <w:szCs w:val="20"/>
           <w:lang w:val="es-ES"/>
         </w:rPr>
-        <w:pict w14:anchorId="1CE77B51">
+        <w:pict w14:anchorId="2A7214CF">
           <v:rect id="_x0000_i1027" style="width:0;height:1.5pt" o:hralign="center" o:hrstd="t" o:hr="t" fillcolor="#a0a0a0" stroked="f"/>
         </w:pict>
       </w:r>
@@ -4498,13 +4518,13 @@
 <file path=word/numbering.xml><?xml version="1.0" encoding="utf-8"?>
 <w:numbering xmlns:wpc="http://schemas.microsoft.com/office/word/2010/wordprocessingCanvas" xmlns:cx="http://schemas.microsoft.com/office/drawing/2014/chartex" xmlns:cx1="http://schemas.microsoft.com/office/drawing/2015/9/8/chartex" xmlns:cx2="http://schemas.microsoft.com/office/drawing/2015/10/21/chartex" xmlns:cx3="http://schemas.microsoft.com/office/drawing/2016/5/9/chartex" xmlns:cx4="http://schemas.microsoft.com/office/drawing/2016/5/10/chartex" xmlns:cx5="http://schemas.microsoft.com/office/drawing/2016/5/11/chartex" xmlns:cx6="http://schemas.microsoft.com/office/drawing/2016/5/12/chartex" xmlns:cx7="http://schemas.microsoft.com/office/drawing/2016/5/13/chartex" xmlns:cx8="http://schemas.microsoft.com/office/drawing/2016/5/14/chartex" xmlns:mc="http://schemas.openxmlformats.org/markup-compatibility/2006" xmlns:aink="http://schemas.microsoft.com/office/drawing/2016/ink" xmlns:am3d="http://schemas.microsoft.com/office/drawing/2017/model3d" xmlns:o="urn:schemas-microsoft-com:office:office" xmlns:oel="http://schemas.microsoft.com/office/2019/extlst" xmlns:r="http://schemas.openxmlformats.org/officeDocument/2006/relationships" xmlns:m="http://schemas.openxmlformats.org/officeDocument/2006/math" xmlns:v="urn:schemas-microsoft-com:vml" xmlns:wp14="http://schemas.microsoft.com/office/word/2010/wordprocessingDrawing" xmlns:wp="http://schemas.openxmlformats.org/drawingml/2006/wordprocessingDrawing" xmlns:w10="urn:schemas-microsoft-com:office:word" xmlns:w="http://schemas.openxmlformats.org/wordprocessingml/2006/main" xmlns:w14="http://schemas.microsoft.com/office/word/2010/wordml" xmlns:w15="http://schemas.microsoft.com/office/word/2012/wordml" xmlns:w16cex="http://schemas.microsoft.com/office/word/2018/wordml/cex" xmlns:w16cid="http://schemas.microsoft.com/office/word/2016/wordml/cid" xmlns:w16="http://schemas.microsoft.com/office/word/2018/wordml" xmlns:w16du="http://schemas.microsoft.com/office/word/2023/wordml/word16du" xmlns:w16sdtdh="http://schemas.microsoft.com/office/word/2020/wordml/sdtdatahash" xmlns:w16sdtfl="http://schemas.microsoft.com/office/word/2024/wordml/sdtformatlock" xmlns:w16se="http://schemas.microsoft.com/office/word/2015/wordml/symex" xmlns:wpg="http://schemas.microsoft.com/office/word/2010/wordprocessingGroup" xmlns:wpi="http://schemas.microsoft.com/office/word/2010/wordprocessingInk" xmlns:wne="http://schemas.microsoft.com/office/word/2006/wordml" xmlns:wps="http://schemas.microsoft.com/office/word/2010/wordprocessingShape" mc:Ignorable="w14 w15 w16se w16cid w16 w16cex w16sdtdh w16sdtfl w16du wp14">
   <w:abstractNum w:abstractNumId="0" w15:restartNumberingAfterBreak="0">
-    <w:nsid w:val="01E029C1"/>
+    <w:nsid w:val="059142DE"/>
     <w:multiLevelType w:val="multilevel"/>
-    <w:tmpl w:val="3BF22536"/>
+    <w:tmpl w:val="86469D88"/>
     <w:lvl w:ilvl="0">
       <w:start w:val="1"/>
-      <w:numFmt w:val="bullet"/>
-      <w:lvlText w:val=""/>
+      <w:numFmt w:val="decimal"/>
+      <w:lvlText w:val="%1."/>
       <w:lvlJc w:val="left"/>
       <w:pPr>
         <w:tabs>
@@ -4512,15 +4532,11 @@
         </w:tabs>
         <w:ind w:left="720" w:hanging="360"/>
       </w:pPr>
-      <w:rPr>
-        <w:rFonts w:ascii="Symbol" w:hAnsi="Symbol" w:hint="default"/>
-        <w:sz w:val="20"/>
-      </w:rPr>
     </w:lvl>
     <w:lvl w:ilvl="1" w:tentative="1">
       <w:start w:val="1"/>
-      <w:numFmt w:val="bullet"/>
-      <w:lvlText w:val="o"/>
+      <w:numFmt w:val="decimal"/>
+      <w:lvlText w:val="%2."/>
       <w:lvlJc w:val="left"/>
       <w:pPr>
         <w:tabs>
@@ -4528,15 +4544,11 @@
         </w:tabs>
         <w:ind w:left="1440" w:hanging="360"/>
       </w:pPr>
-      <w:rPr>
-        <w:rFonts w:ascii="Courier New" w:hAnsi="Courier New" w:hint="default"/>
-        <w:sz w:val="20"/>
-      </w:rPr>
     </w:lvl>
     <w:lvl w:ilvl="2" w:tentative="1">
       <w:start w:val="1"/>
-      <w:numFmt w:val="bullet"/>
-      <w:lvlText w:val=""/>
+      <w:numFmt w:val="decimal"/>
+      <w:lvlText w:val="%3."/>
       <w:lvlJc w:val="left"/>
       <w:pPr>
         <w:tabs>
@@ -4544,15 +4556,11 @@
         </w:tabs>
         <w:ind w:left="2160" w:hanging="360"/>
       </w:pPr>
-      <w:rPr>
-        <w:rFonts w:ascii="Wingdings" w:hAnsi="Wingdings" w:hint="default"/>
-        <w:sz w:val="20"/>
-      </w:rPr>
     </w:lvl>
     <w:lvl w:ilvl="3" w:tentative="1">
       <w:start w:val="1"/>
-      <w:numFmt w:val="bullet"/>
-      <w:lvlText w:val=""/>
+      <w:numFmt w:val="decimal"/>
+      <w:lvlText w:val="%4."/>
       <w:lvlJc w:val="left"/>
       <w:pPr>
         <w:tabs>
@@ -4560,15 +4568,11 @@
         </w:tabs>
         <w:ind w:left="2880" w:hanging="360"/>
       </w:pPr>
-      <w:rPr>
-        <w:rFonts w:ascii="Wingdings" w:hAnsi="Wingdings" w:hint="default"/>
-        <w:sz w:val="20"/>
-      </w:rPr>
     </w:lvl>
     <w:lvl w:ilvl="4" w:tentative="1">
       <w:start w:val="1"/>
-      <w:numFmt w:val="bullet"/>
-      <w:lvlText w:val=""/>
+      <w:numFmt w:val="decimal"/>
+      <w:lvlText w:val="%5."/>
       <w:lvlJc w:val="left"/>
       <w:pPr>
         <w:tabs>
@@ -4576,15 +4580,11 @@
         </w:tabs>
         <w:ind w:left="3600" w:hanging="360"/>
       </w:pPr>
-      <w:rPr>
-        <w:rFonts w:ascii="Wingdings" w:hAnsi="Wingdings" w:hint="default"/>
-        <w:sz w:val="20"/>
-      </w:rPr>
     </w:lvl>
     <w:lvl w:ilvl="5" w:tentative="1">
       <w:start w:val="1"/>
-      <w:numFmt w:val="bullet"/>
-      <w:lvlText w:val=""/>
+      <w:numFmt w:val="decimal"/>
+      <w:lvlText w:val="%6."/>
       <w:lvlJc w:val="left"/>
       <w:pPr>
         <w:tabs>
@@ -4592,15 +4592,11 @@
         </w:tabs>
         <w:ind w:left="4320" w:hanging="360"/>
       </w:pPr>
-      <w:rPr>
-        <w:rFonts w:ascii="Wingdings" w:hAnsi="Wingdings" w:hint="default"/>
-        <w:sz w:val="20"/>
-      </w:rPr>
     </w:lvl>
     <w:lvl w:ilvl="6" w:tentative="1">
       <w:start w:val="1"/>
-      <w:numFmt w:val="bullet"/>
-      <w:lvlText w:val=""/>
+      <w:numFmt w:val="decimal"/>
+      <w:lvlText w:val="%7."/>
       <w:lvlJc w:val="left"/>
       <w:pPr>
         <w:tabs>
@@ -4608,15 +4604,11 @@
         </w:tabs>
         <w:ind w:left="5040" w:hanging="360"/>
       </w:pPr>
-      <w:rPr>
-        <w:rFonts w:ascii="Wingdings" w:hAnsi="Wingdings" w:hint="default"/>
-        <w:sz w:val="20"/>
-      </w:rPr>
     </w:lvl>
     <w:lvl w:ilvl="7" w:tentative="1">
       <w:start w:val="1"/>
-      <w:numFmt w:val="bullet"/>
-      <w:lvlText w:val=""/>
+      <w:numFmt w:val="decimal"/>
+      <w:lvlText w:val="%8."/>
       <w:lvlJc w:val="left"/>
       <w:pPr>
         <w:tabs>
@@ -4624,15 +4616,11 @@
         </w:tabs>
         <w:ind w:left="5760" w:hanging="360"/>
       </w:pPr>
-      <w:rPr>
-        <w:rFonts w:ascii="Wingdings" w:hAnsi="Wingdings" w:hint="default"/>
-        <w:sz w:val="20"/>
-      </w:rPr>
     </w:lvl>
     <w:lvl w:ilvl="8" w:tentative="1">
       <w:start w:val="1"/>
-      <w:numFmt w:val="bullet"/>
-      <w:lvlText w:val=""/>
+      <w:numFmt w:val="decimal"/>
+      <w:lvlText w:val="%9."/>
       <w:lvlJc w:val="left"/>
       <w:pPr>
         <w:tabs>
@@ -4640,16 +4628,12 @@
         </w:tabs>
         <w:ind w:left="6480" w:hanging="360"/>
       </w:pPr>
-      <w:rPr>
-        <w:rFonts w:ascii="Wingdings" w:hAnsi="Wingdings" w:hint="default"/>
-        <w:sz w:val="20"/>
-      </w:rPr>
     </w:lvl>
   </w:abstractNum>
   <w:abstractNum w:abstractNumId="1" w15:restartNumberingAfterBreak="0">
-    <w:nsid w:val="048A48DC"/>
+    <w:nsid w:val="0F241ACA"/>
     <w:multiLevelType w:val="multilevel"/>
-    <w:tmpl w:val="C354F9B0"/>
+    <w:tmpl w:val="D6341CC8"/>
     <w:lvl w:ilvl="0">
       <w:start w:val="1"/>
       <w:numFmt w:val="decimal"/>
@@ -4760,9 +4744,9 @@
     </w:lvl>
   </w:abstractNum>
   <w:abstractNum w:abstractNumId="2" w15:restartNumberingAfterBreak="0">
-    <w:nsid w:val="09CE51A6"/>
+    <w:nsid w:val="10595B60"/>
     <w:multiLevelType w:val="multilevel"/>
-    <w:tmpl w:val="307E9B42"/>
+    <w:tmpl w:val="7F1A8674"/>
     <w:lvl w:ilvl="0">
       <w:start w:val="1"/>
       <w:numFmt w:val="bullet"/>
@@ -4909,13 +4893,13 @@
     </w:lvl>
   </w:abstractNum>
   <w:abstractNum w:abstractNumId="3" w15:restartNumberingAfterBreak="0">
-    <w:nsid w:val="0A714B54"/>
+    <w:nsid w:val="133336EF"/>
     <w:multiLevelType w:val="multilevel"/>
-    <w:tmpl w:val="5720E7AC"/>
+    <w:tmpl w:val="4A7E47AA"/>
     <w:lvl w:ilvl="0">
       <w:start w:val="1"/>
-      <w:numFmt w:val="bullet"/>
-      <w:lvlText w:val=""/>
+      <w:numFmt w:val="decimal"/>
+      <w:lvlText w:val="%1."/>
       <w:lvlJc w:val="left"/>
       <w:pPr>
         <w:tabs>
@@ -4923,15 +4907,11 @@
         </w:tabs>
         <w:ind w:left="720" w:hanging="360"/>
       </w:pPr>
-      <w:rPr>
-        <w:rFonts w:ascii="Symbol" w:hAnsi="Symbol" w:hint="default"/>
-        <w:sz w:val="20"/>
-      </w:rPr>
     </w:lvl>
     <w:lvl w:ilvl="1" w:tentative="1">
       <w:start w:val="1"/>
-      <w:numFmt w:val="bullet"/>
-      <w:lvlText w:val="o"/>
+      <w:numFmt w:val="decimal"/>
+      <w:lvlText w:val="%2."/>
       <w:lvlJc w:val="left"/>
       <w:pPr>
         <w:tabs>
@@ -4939,15 +4919,11 @@
         </w:tabs>
         <w:ind w:left="1440" w:hanging="360"/>
       </w:pPr>
-      <w:rPr>
-        <w:rFonts w:ascii="Courier New" w:hAnsi="Courier New" w:hint="default"/>
-        <w:sz w:val="20"/>
-      </w:rPr>
     </w:lvl>
     <w:lvl w:ilvl="2" w:tentative="1">
       <w:start w:val="1"/>
-      <w:numFmt w:val="bullet"/>
-      <w:lvlText w:val=""/>
+      <w:numFmt w:val="decimal"/>
+      <w:lvlText w:val="%3."/>
       <w:lvlJc w:val="left"/>
       <w:pPr>
         <w:tabs>
@@ -4955,15 +4931,11 @@
         </w:tabs>
         <w:ind w:left="2160" w:hanging="360"/>
       </w:pPr>
-      <w:rPr>
-        <w:rFonts w:ascii="Wingdings" w:hAnsi="Wingdings" w:hint="default"/>
-        <w:sz w:val="20"/>
-      </w:rPr>
     </w:lvl>
     <w:lvl w:ilvl="3" w:tentative="1">
       <w:start w:val="1"/>
-      <w:numFmt w:val="bullet"/>
-      <w:lvlText w:val=""/>
+      <w:numFmt w:val="decimal"/>
+      <w:lvlText w:val="%4."/>
       <w:lvlJc w:val="left"/>
       <w:pPr>
         <w:tabs>
@@ -4971,15 +4943,11 @@
         </w:tabs>
         <w:ind w:left="2880" w:hanging="360"/>
       </w:pPr>
-      <w:rPr>
-        <w:rFonts w:ascii="Wingdings" w:hAnsi="Wingdings" w:hint="default"/>
-        <w:sz w:val="20"/>
-      </w:rPr>
     </w:lvl>
     <w:lvl w:ilvl="4" w:tentative="1">
       <w:start w:val="1"/>
-      <w:numFmt w:val="bullet"/>
-      <w:lvlText w:val=""/>
+      <w:numFmt w:val="decimal"/>
+      <w:lvlText w:val="%5."/>
       <w:lvlJc w:val="left"/>
       <w:pPr>
         <w:tabs>
@@ -4987,15 +4955,11 @@
         </w:tabs>
         <w:ind w:left="3600" w:hanging="360"/>
       </w:pPr>
-      <w:rPr>
-        <w:rFonts w:ascii="Wingdings" w:hAnsi="Wingdings" w:hint="default"/>
-        <w:sz w:val="20"/>
-      </w:rPr>
     </w:lvl>
     <w:lvl w:ilvl="5" w:tentative="1">
       <w:start w:val="1"/>
-      <w:numFmt w:val="bullet"/>
-      <w:lvlText w:val=""/>
+      <w:numFmt w:val="decimal"/>
+      <w:lvlText w:val="%6."/>
       <w:lvlJc w:val="left"/>
       <w:pPr>
         <w:tabs>
@@ -5003,15 +4967,11 @@
         </w:tabs>
         <w:ind w:left="4320" w:hanging="360"/>
       </w:pPr>
-      <w:rPr>
-        <w:rFonts w:ascii="Wingdings" w:hAnsi="Wingdings" w:hint="default"/>
-        <w:sz w:val="20"/>
-      </w:rPr>
     </w:lvl>
     <w:lvl w:ilvl="6" w:tentative="1">
       <w:start w:val="1"/>
-      <w:numFmt w:val="bullet"/>
-      <w:lvlText w:val=""/>
+      <w:numFmt w:val="decimal"/>
+      <w:lvlText w:val="%7."/>
       <w:lvlJc w:val="left"/>
       <w:pPr>
         <w:tabs>
@@ -5019,15 +4979,11 @@
         </w:tabs>
         <w:ind w:left="5040" w:hanging="360"/>
       </w:pPr>
-      <w:rPr>
-        <w:rFonts w:ascii="Wingdings" w:hAnsi="Wingdings" w:hint="default"/>
-        <w:sz w:val="20"/>
-      </w:rPr>
     </w:lvl>
     <w:lvl w:ilvl="7" w:tentative="1">
       <w:start w:val="1"/>
-      <w:numFmt w:val="bullet"/>
-      <w:lvlText w:val=""/>
+      <w:numFmt w:val="decimal"/>
+      <w:lvlText w:val="%8."/>
       <w:lvlJc w:val="left"/>
       <w:pPr>
         <w:tabs>
@@ -5035,15 +4991,11 @@
         </w:tabs>
         <w:ind w:left="5760" w:hanging="360"/>
       </w:pPr>
-      <w:rPr>
-        <w:rFonts w:ascii="Wingdings" w:hAnsi="Wingdings" w:hint="default"/>
-        <w:sz w:val="20"/>
-      </w:rPr>
     </w:lvl>
     <w:lvl w:ilvl="8" w:tentative="1">
       <w:start w:val="1"/>
-      <w:numFmt w:val="bullet"/>
-      <w:lvlText w:val=""/>
+      <w:numFmt w:val="decimal"/>
+      <w:lvlText w:val="%9."/>
       <w:lvlJc w:val="left"/>
       <w:pPr>
         <w:tabs>
@@ -5051,20 +5003,16 @@
         </w:tabs>
         <w:ind w:left="6480" w:hanging="360"/>
       </w:pPr>
-      <w:rPr>
-        <w:rFonts w:ascii="Wingdings" w:hAnsi="Wingdings" w:hint="default"/>
-        <w:sz w:val="20"/>
-      </w:rPr>
     </w:lvl>
   </w:abstractNum>
   <w:abstractNum w:abstractNumId="4" w15:restartNumberingAfterBreak="0">
-    <w:nsid w:val="0B851E73"/>
+    <w:nsid w:val="1A5150B2"/>
     <w:multiLevelType w:val="multilevel"/>
-    <w:tmpl w:val="A0347C9A"/>
+    <w:tmpl w:val="031A4D1C"/>
     <w:lvl w:ilvl="0">
       <w:start w:val="1"/>
-      <w:numFmt w:val="decimal"/>
-      <w:lvlText w:val="%1."/>
+      <w:numFmt w:val="bullet"/>
+      <w:lvlText w:val=""/>
       <w:lvlJc w:val="left"/>
       <w:pPr>
         <w:tabs>
@@ -5072,11 +5020,15 @@
         </w:tabs>
         <w:ind w:left="720" w:hanging="360"/>
       </w:pPr>
+      <w:rPr>
+        <w:rFonts w:ascii="Symbol" w:hAnsi="Symbol" w:hint="default"/>
+        <w:sz w:val="20"/>
+      </w:rPr>
     </w:lvl>
     <w:lvl w:ilvl="1" w:tentative="1">
       <w:start w:val="1"/>
-      <w:numFmt w:val="decimal"/>
-      <w:lvlText w:val="%2."/>
+      <w:numFmt w:val="bullet"/>
+      <w:lvlText w:val="o"/>
       <w:lvlJc w:val="left"/>
       <w:pPr>
         <w:tabs>
@@ -5084,11 +5036,15 @@
         </w:tabs>
         <w:ind w:left="1440" w:hanging="360"/>
       </w:pPr>
+      <w:rPr>
+        <w:rFonts w:ascii="Courier New" w:hAnsi="Courier New" w:hint="default"/>
+        <w:sz w:val="20"/>
+      </w:rPr>
     </w:lvl>
     <w:lvl w:ilvl="2" w:tentative="1">
       <w:start w:val="1"/>
-      <w:numFmt w:val="decimal"/>
-      <w:lvlText w:val="%3."/>
+      <w:numFmt w:val="bullet"/>
+      <w:lvlText w:val=""/>
       <w:lvlJc w:val="left"/>
       <w:pPr>
         <w:tabs>
@@ -5096,11 +5052,15 @@
         </w:tabs>
         <w:ind w:left="2160" w:hanging="360"/>
       </w:pPr>
+      <w:rPr>
+        <w:rFonts w:ascii="Wingdings" w:hAnsi="Wingdings" w:hint="default"/>
+        <w:sz w:val="20"/>
+      </w:rPr>
     </w:lvl>
     <w:lvl w:ilvl="3" w:tentative="1">
       <w:start w:val="1"/>
-      <w:numFmt w:val="decimal"/>
-      <w:lvlText w:val="%4."/>
+      <w:numFmt w:val="bullet"/>
+      <w:lvlText w:val=""/>
       <w:lvlJc w:val="left"/>
       <w:pPr>
         <w:tabs>
@@ -5108,11 +5068,15 @@
         </w:tabs>
         <w:ind w:left="2880" w:hanging="360"/>
       </w:pPr>
+      <w:rPr>
+        <w:rFonts w:ascii="Wingdings" w:hAnsi="Wingdings" w:hint="default"/>
+        <w:sz w:val="20"/>
+      </w:rPr>
     </w:lvl>
     <w:lvl w:ilvl="4" w:tentative="1">
       <w:start w:val="1"/>
-      <w:numFmt w:val="decimal"/>
-      <w:lvlText w:val="%5."/>
+      <w:numFmt w:val="bullet"/>
+      <w:lvlText w:val=""/>
       <w:lvlJc w:val="left"/>
       <w:pPr>
         <w:tabs>
@@ -5120,11 +5084,15 @@
         </w:tabs>
         <w:ind w:left="3600" w:hanging="360"/>
       </w:pPr>
+      <w:rPr>
+        <w:rFonts w:ascii="Wingdings" w:hAnsi="Wingdings" w:hint="default"/>
+        <w:sz w:val="20"/>
+      </w:rPr>
     </w:lvl>
     <w:lvl w:ilvl="5" w:tentative="1">
       <w:start w:val="1"/>
-      <w:numFmt w:val="decimal"/>
-      <w:lvlText w:val="%6."/>
+      <w:numFmt w:val="bullet"/>
+      <w:lvlText w:val=""/>
       <w:lvlJc w:val="left"/>
       <w:pPr>
         <w:tabs>
@@ -5132,11 +5100,15 @@
         </w:tabs>
         <w:ind w:left="4320" w:hanging="360"/>
       </w:pPr>
+      <w:rPr>
+        <w:rFonts w:ascii="Wingdings" w:hAnsi="Wingdings" w:hint="default"/>
+        <w:sz w:val="20"/>
+      </w:rPr>
     </w:lvl>
     <w:lvl w:ilvl="6" w:tentative="1">
       <w:start w:val="1"/>
-      <w:numFmt w:val="decimal"/>
-      <w:lvlText w:val="%7."/>
+      <w:numFmt w:val="bullet"/>
+      <w:lvlText w:val=""/>
       <w:lvlJc w:val="left"/>
       <w:pPr>
         <w:tabs>
@@ -5144,11 +5116,15 @@
         </w:tabs>
         <w:ind w:left="5040" w:hanging="360"/>
       </w:pPr>
+      <w:rPr>
+        <w:rFonts w:ascii="Wingdings" w:hAnsi="Wingdings" w:hint="default"/>
+        <w:sz w:val="20"/>
+      </w:rPr>
     </w:lvl>
     <w:lvl w:ilvl="7" w:tentative="1">
       <w:start w:val="1"/>
-      <w:numFmt w:val="decimal"/>
-      <w:lvlText w:val="%8."/>
+      <w:numFmt w:val="bullet"/>
+      <w:lvlText w:val=""/>
       <w:lvlJc w:val="left"/>
       <w:pPr>
         <w:tabs>
@@ -5156,11 +5132,15 @@
         </w:tabs>
         <w:ind w:left="5760" w:hanging="360"/>
       </w:pPr>
+      <w:rPr>
+        <w:rFonts w:ascii="Wingdings" w:hAnsi="Wingdings" w:hint="default"/>
+        <w:sz w:val="20"/>
+      </w:rPr>
     </w:lvl>
     <w:lvl w:ilvl="8" w:tentative="1">
       <w:start w:val="1"/>
-      <w:numFmt w:val="decimal"/>
-      <w:lvlText w:val="%9."/>
+      <w:numFmt w:val="bullet"/>
+      <w:lvlText w:val=""/>
       <w:lvlJc w:val="left"/>
       <w:pPr>
         <w:tabs>
@@ -5168,12 +5148,16 @@
         </w:tabs>
         <w:ind w:left="6480" w:hanging="360"/>
       </w:pPr>
+      <w:rPr>
+        <w:rFonts w:ascii="Wingdings" w:hAnsi="Wingdings" w:hint="default"/>
+        <w:sz w:val="20"/>
+      </w:rPr>
     </w:lvl>
   </w:abstractNum>
   <w:abstractNum w:abstractNumId="5" w15:restartNumberingAfterBreak="0">
-    <w:nsid w:val="0E772965"/>
+    <w:nsid w:val="1B385BEF"/>
     <w:multiLevelType w:val="multilevel"/>
-    <w:tmpl w:val="79C29AC8"/>
+    <w:tmpl w:val="349E1FA2"/>
     <w:lvl w:ilvl="0">
       <w:start w:val="1"/>
       <w:numFmt w:val="bullet"/>
@@ -5320,9 +5304,9 @@
     </w:lvl>
   </w:abstractNum>
   <w:abstractNum w:abstractNumId="6" w15:restartNumberingAfterBreak="0">
-    <w:nsid w:val="10524398"/>
+    <w:nsid w:val="1E0E3C7E"/>
     <w:multiLevelType w:val="multilevel"/>
-    <w:tmpl w:val="CA8003F6"/>
+    <w:tmpl w:val="00760AA8"/>
     <w:lvl w:ilvl="0">
       <w:start w:val="1"/>
       <w:numFmt w:val="decimal"/>
@@ -5433,13 +5417,13 @@
     </w:lvl>
   </w:abstractNum>
   <w:abstractNum w:abstractNumId="7" w15:restartNumberingAfterBreak="0">
-    <w:nsid w:val="13822736"/>
+    <w:nsid w:val="28AB5624"/>
     <w:multiLevelType w:val="multilevel"/>
-    <w:tmpl w:val="F61894DE"/>
+    <w:tmpl w:val="DDF8F47C"/>
     <w:lvl w:ilvl="0">
       <w:start w:val="1"/>
-      <w:numFmt w:val="bullet"/>
-      <w:lvlText w:val=""/>
+      <w:numFmt w:val="decimal"/>
+      <w:lvlText w:val="%1."/>
       <w:lvlJc w:val="left"/>
       <w:pPr>
         <w:tabs>
@@ -5447,15 +5431,11 @@
         </w:tabs>
         <w:ind w:left="720" w:hanging="360"/>
       </w:pPr>
-      <w:rPr>
-        <w:rFonts w:ascii="Symbol" w:hAnsi="Symbol" w:hint="default"/>
-        <w:sz w:val="20"/>
-      </w:rPr>
     </w:lvl>
     <w:lvl w:ilvl="1" w:tentative="1">
       <w:start w:val="1"/>
-      <w:numFmt w:val="bullet"/>
-      <w:lvlText w:val="o"/>
+      <w:numFmt w:val="decimal"/>
+      <w:lvlText w:val="%2."/>
       <w:lvlJc w:val="left"/>
       <w:pPr>
         <w:tabs>
@@ -5463,15 +5443,11 @@
         </w:tabs>
         <w:ind w:left="1440" w:hanging="360"/>
       </w:pPr>
-      <w:rPr>
-        <w:rFonts w:ascii="Courier New" w:hAnsi="Courier New" w:hint="default"/>
-        <w:sz w:val="20"/>
-      </w:rPr>
     </w:lvl>
     <w:lvl w:ilvl="2" w:tentative="1">
       <w:start w:val="1"/>
-      <w:numFmt w:val="bullet"/>
-      <w:lvlText w:val=""/>
+      <w:numFmt w:val="decimal"/>
+      <w:lvlText w:val="%3."/>
       <w:lvlJc w:val="left"/>
       <w:pPr>
         <w:tabs>
@@ -5479,15 +5455,11 @@
         </w:tabs>
         <w:ind w:left="2160" w:hanging="360"/>
       </w:pPr>
-      <w:rPr>
-        <w:rFonts w:ascii="Wingdings" w:hAnsi="Wingdings" w:hint="default"/>
-        <w:sz w:val="20"/>
-      </w:rPr>
     </w:lvl>
     <w:lvl w:ilvl="3" w:tentative="1">
       <w:start w:val="1"/>
-      <w:numFmt w:val="bullet"/>
-      <w:lvlText w:val=""/>
+      <w:numFmt w:val="decimal"/>
+      <w:lvlText w:val="%4."/>
       <w:lvlJc w:val="left"/>
       <w:pPr>
         <w:tabs>
@@ -5495,15 +5467,11 @@
         </w:tabs>
         <w:ind w:left="2880" w:hanging="360"/>
       </w:pPr>
-      <w:rPr>
-        <w:rFonts w:ascii="Wingdings" w:hAnsi="Wingdings" w:hint="default"/>
-        <w:sz w:val="20"/>
-      </w:rPr>
     </w:lvl>
     <w:lvl w:ilvl="4" w:tentative="1">
       <w:start w:val="1"/>
-      <w:numFmt w:val="bullet"/>
-      <w:lvlText w:val=""/>
+      <w:numFmt w:val="decimal"/>
+      <w:lvlText w:val="%5."/>
       <w:lvlJc w:val="left"/>
       <w:pPr>
         <w:tabs>
@@ -5511,15 +5479,11 @@
         </w:tabs>
         <w:ind w:left="3600" w:hanging="360"/>
       </w:pPr>
-      <w:rPr>
-        <w:rFonts w:ascii="Wingdings" w:hAnsi="Wingdings" w:hint="default"/>
-        <w:sz w:val="20"/>
-      </w:rPr>
     </w:lvl>
     <w:lvl w:ilvl="5" w:tentative="1">
       <w:start w:val="1"/>
-      <w:numFmt w:val="bullet"/>
-      <w:lvlText w:val=""/>
+      <w:numFmt w:val="decimal"/>
+      <w:lvlText w:val="%6."/>
       <w:lvlJc w:val="left"/>
       <w:pPr>
         <w:tabs>
@@ -5527,15 +5491,11 @@
         </w:tabs>
         <w:ind w:left="4320" w:hanging="360"/>
       </w:pPr>
-      <w:rPr>
-        <w:rFonts w:ascii="Wingdings" w:hAnsi="Wingdings" w:hint="default"/>
-        <w:sz w:val="20"/>
-      </w:rPr>
     </w:lvl>
     <w:lvl w:ilvl="6" w:tentative="1">
       <w:start w:val="1"/>
-      <w:numFmt w:val="bullet"/>
-      <w:lvlText w:val=""/>
+      <w:numFmt w:val="decimal"/>
+      <w:lvlText w:val="%7."/>
       <w:lvlJc w:val="left"/>
       <w:pPr>
         <w:tabs>
@@ -5543,15 +5503,11 @@
         </w:tabs>
         <w:ind w:left="5040" w:hanging="360"/>
       </w:pPr>
-      <w:rPr>
-        <w:rFonts w:ascii="Wingdings" w:hAnsi="Wingdings" w:hint="default"/>
-        <w:sz w:val="20"/>
-      </w:rPr>
     </w:lvl>
     <w:lvl w:ilvl="7" w:tentative="1">
       <w:start w:val="1"/>
-      <w:numFmt w:val="bullet"/>
-      <w:lvlText w:val=""/>
+      <w:numFmt w:val="decimal"/>
+      <w:lvlText w:val="%8."/>
       <w:lvlJc w:val="left"/>
       <w:pPr>
         <w:tabs>
@@ -5559,15 +5515,11 @@
         </w:tabs>
         <w:ind w:left="5760" w:hanging="360"/>
       </w:pPr>
-      <w:rPr>
-        <w:rFonts w:ascii="Wingdings" w:hAnsi="Wingdings" w:hint="default"/>
-        <w:sz w:val="20"/>
-      </w:rPr>
     </w:lvl>
     <w:lvl w:ilvl="8" w:tentative="1">
       <w:start w:val="1"/>
-      <w:numFmt w:val="bullet"/>
-      <w:lvlText w:val=""/>
+      <w:numFmt w:val="decimal"/>
+      <w:lvlText w:val="%9."/>
       <w:lvlJc w:val="left"/>
       <w:pPr>
         <w:tabs>
@@ -5575,16 +5527,12 @@
         </w:tabs>
         <w:ind w:left="6480" w:hanging="360"/>
       </w:pPr>
-      <w:rPr>
-        <w:rFonts w:ascii="Wingdings" w:hAnsi="Wingdings" w:hint="default"/>
-        <w:sz w:val="20"/>
-      </w:rPr>
     </w:lvl>
   </w:abstractNum>
   <w:abstractNum w:abstractNumId="8" w15:restartNumberingAfterBreak="0">
-    <w:nsid w:val="1DED56C5"/>
+    <w:nsid w:val="2A05442E"/>
     <w:multiLevelType w:val="multilevel"/>
-    <w:tmpl w:val="02748626"/>
+    <w:tmpl w:val="B1CC6D70"/>
     <w:lvl w:ilvl="0">
       <w:start w:val="1"/>
       <w:numFmt w:val="bullet"/>
@@ -5731,9 +5679,9 @@
     </w:lvl>
   </w:abstractNum>
   <w:abstractNum w:abstractNumId="9" w15:restartNumberingAfterBreak="0">
-    <w:nsid w:val="1F040D42"/>
+    <w:nsid w:val="2D566B73"/>
     <w:multiLevelType w:val="multilevel"/>
-    <w:tmpl w:val="B92C64E6"/>
+    <w:tmpl w:val="D0CA7148"/>
     <w:lvl w:ilvl="0">
       <w:start w:val="1"/>
       <w:numFmt w:val="bullet"/>
@@ -5880,9 +5828,9 @@
     </w:lvl>
   </w:abstractNum>
   <w:abstractNum w:abstractNumId="10" w15:restartNumberingAfterBreak="0">
-    <w:nsid w:val="24DC4738"/>
+    <w:nsid w:val="3036362C"/>
     <w:multiLevelType w:val="multilevel"/>
-    <w:tmpl w:val="F67C8EB2"/>
+    <w:tmpl w:val="E4A64808"/>
     <w:lvl w:ilvl="0">
       <w:start w:val="1"/>
       <w:numFmt w:val="bullet"/>
@@ -6029,13 +5977,13 @@
     </w:lvl>
   </w:abstractNum>
   <w:abstractNum w:abstractNumId="11" w15:restartNumberingAfterBreak="0">
-    <w:nsid w:val="281F69E6"/>
+    <w:nsid w:val="35C336D9"/>
     <w:multiLevelType w:val="multilevel"/>
-    <w:tmpl w:val="C97AD7C4"/>
+    <w:tmpl w:val="A2004D82"/>
     <w:lvl w:ilvl="0">
       <w:start w:val="1"/>
-      <w:numFmt w:val="decimal"/>
-      <w:lvlText w:val="%1."/>
+      <w:numFmt w:val="bullet"/>
+      <w:lvlText w:val=""/>
       <w:lvlJc w:val="left"/>
       <w:pPr>
         <w:tabs>
@@ -6043,11 +5991,15 @@
         </w:tabs>
         <w:ind w:left="720" w:hanging="360"/>
       </w:pPr>
+      <w:rPr>
+        <w:rFonts w:ascii="Symbol" w:hAnsi="Symbol" w:hint="default"/>
+        <w:sz w:val="20"/>
+      </w:rPr>
     </w:lvl>
     <w:lvl w:ilvl="1" w:tentative="1">
       <w:start w:val="1"/>
-      <w:numFmt w:val="decimal"/>
-      <w:lvlText w:val="%2."/>
+      <w:numFmt w:val="bullet"/>
+      <w:lvlText w:val="o"/>
       <w:lvlJc w:val="left"/>
       <w:pPr>
         <w:tabs>
@@ -6055,11 +6007,15 @@
         </w:tabs>
         <w:ind w:left="1440" w:hanging="360"/>
       </w:pPr>
+      <w:rPr>
+        <w:rFonts w:ascii="Courier New" w:hAnsi="Courier New" w:hint="default"/>
+        <w:sz w:val="20"/>
+      </w:rPr>
     </w:lvl>
     <w:lvl w:ilvl="2" w:tentative="1">
       <w:start w:val="1"/>
-      <w:numFmt w:val="decimal"/>
-      <w:lvlText w:val="%3."/>
+      <w:numFmt w:val="bullet"/>
+      <w:lvlText w:val=""/>
       <w:lvlJc w:val="left"/>
       <w:pPr>
         <w:tabs>
@@ -6067,11 +6023,15 @@
         </w:tabs>
         <w:ind w:left="2160" w:hanging="360"/>
       </w:pPr>
+      <w:rPr>
+        <w:rFonts w:ascii="Wingdings" w:hAnsi="Wingdings" w:hint="default"/>
+        <w:sz w:val="20"/>
+      </w:rPr>
     </w:lvl>
     <w:lvl w:ilvl="3" w:tentative="1">
       <w:start w:val="1"/>
-      <w:numFmt w:val="decimal"/>
-      <w:lvlText w:val="%4."/>
+      <w:numFmt w:val="bullet"/>
+      <w:lvlText w:val=""/>
       <w:lvlJc w:val="left"/>
       <w:pPr>
         <w:tabs>
@@ -6079,11 +6039,15 @@
         </w:tabs>
         <w:ind w:left="2880" w:hanging="360"/>
       </w:pPr>
+      <w:rPr>
+        <w:rFonts w:ascii="Wingdings" w:hAnsi="Wingdings" w:hint="default"/>
+        <w:sz w:val="20"/>
+      </w:rPr>
     </w:lvl>
     <w:lvl w:ilvl="4" w:tentative="1">
       <w:start w:val="1"/>
-      <w:numFmt w:val="decimal"/>
-      <w:lvlText w:val="%5."/>
+      <w:numFmt w:val="bullet"/>
+      <w:lvlText w:val=""/>
       <w:lvlJc w:val="left"/>
       <w:pPr>
         <w:tabs>
@@ -6091,11 +6055,15 @@
         </w:tabs>
         <w:ind w:left="3600" w:hanging="360"/>
       </w:pPr>
+      <w:rPr>
+        <w:rFonts w:ascii="Wingdings" w:hAnsi="Wingdings" w:hint="default"/>
+        <w:sz w:val="20"/>
+      </w:rPr>
     </w:lvl>
     <w:lvl w:ilvl="5" w:tentative="1">
       <w:start w:val="1"/>
-      <w:numFmt w:val="decimal"/>
-      <w:lvlText w:val="%6."/>
+      <w:numFmt w:val="bullet"/>
+      <w:lvlText w:val=""/>
       <w:lvlJc w:val="left"/>
       <w:pPr>
         <w:tabs>
@@ -6103,11 +6071,15 @@
         </w:tabs>
         <w:ind w:left="4320" w:hanging="360"/>
       </w:pPr>
+      <w:rPr>
+        <w:rFonts w:ascii="Wingdings" w:hAnsi="Wingdings" w:hint="default"/>
+        <w:sz w:val="20"/>
+      </w:rPr>
     </w:lvl>
     <w:lvl w:ilvl="6" w:tentative="1">
       <w:start w:val="1"/>
-      <w:numFmt w:val="decimal"/>
-      <w:lvlText w:val="%7."/>
+      <w:numFmt w:val="bullet"/>
+      <w:lvlText w:val=""/>
       <w:lvlJc w:val="left"/>
       <w:pPr>
         <w:tabs>
@@ -6115,11 +6087,15 @@
         </w:tabs>
         <w:ind w:left="5040" w:hanging="360"/>
       </w:pPr>
+      <w:rPr>
+        <w:rFonts w:ascii="Wingdings" w:hAnsi="Wingdings" w:hint="default"/>
+        <w:sz w:val="20"/>
+      </w:rPr>
     </w:lvl>
     <w:lvl w:ilvl="7" w:tentative="1">
       <w:start w:val="1"/>
-      <w:numFmt w:val="decimal"/>
-      <w:lvlText w:val="%8."/>
+      <w:numFmt w:val="bullet"/>
+      <w:lvlText w:val=""/>
       <w:lvlJc w:val="left"/>
       <w:pPr>
         <w:tabs>
@@ -6127,11 +6103,15 @@
         </w:tabs>
         <w:ind w:left="5760" w:hanging="360"/>
       </w:pPr>
+      <w:rPr>
+        <w:rFonts w:ascii="Wingdings" w:hAnsi="Wingdings" w:hint="default"/>
+        <w:sz w:val="20"/>
+      </w:rPr>
     </w:lvl>
     <w:lvl w:ilvl="8" w:tentative="1">
       <w:start w:val="1"/>
-      <w:numFmt w:val="decimal"/>
-      <w:lvlText w:val="%9."/>
+      <w:numFmt w:val="bullet"/>
+      <w:lvlText w:val=""/>
       <w:lvlJc w:val="left"/>
       <w:pPr>
         <w:tabs>
@@ -6139,16 +6119,20 @@
         </w:tabs>
         <w:ind w:left="6480" w:hanging="360"/>
       </w:pPr>
+      <w:rPr>
+        <w:rFonts w:ascii="Wingdings" w:hAnsi="Wingdings" w:hint="default"/>
+        <w:sz w:val="20"/>
+      </w:rPr>
     </w:lvl>
   </w:abstractNum>
   <w:abstractNum w:abstractNumId="12" w15:restartNumberingAfterBreak="0">
-    <w:nsid w:val="29931651"/>
+    <w:nsid w:val="39077174"/>
     <w:multiLevelType w:val="multilevel"/>
-    <w:tmpl w:val="B8D2D42A"/>
+    <w:tmpl w:val="759686D6"/>
     <w:lvl w:ilvl="0">
       <w:start w:val="1"/>
-      <w:numFmt w:val="bullet"/>
-      <w:lvlText w:val=""/>
+      <w:numFmt w:val="decimal"/>
+      <w:lvlText w:val="%1."/>
       <w:lvlJc w:val="left"/>
       <w:pPr>
         <w:tabs>
@@ -6156,15 +6140,11 @@
         </w:tabs>
         <w:ind w:left="720" w:hanging="360"/>
       </w:pPr>
-      <w:rPr>
-        <w:rFonts w:ascii="Symbol" w:hAnsi="Symbol" w:hint="default"/>
-        <w:sz w:val="20"/>
-      </w:rPr>
     </w:lvl>
     <w:lvl w:ilvl="1" w:tentative="1">
       <w:start w:val="1"/>
-      <w:numFmt w:val="bullet"/>
-      <w:lvlText w:val="o"/>
+      <w:numFmt w:val="decimal"/>
+      <w:lvlText w:val="%2."/>
       <w:lvlJc w:val="left"/>
       <w:pPr>
         <w:tabs>
@@ -6172,15 +6152,11 @@
         </w:tabs>
         <w:ind w:left="1440" w:hanging="360"/>
       </w:pPr>
-      <w:rPr>
-        <w:rFonts w:ascii="Courier New" w:hAnsi="Courier New" w:hint="default"/>
-        <w:sz w:val="20"/>
-      </w:rPr>
     </w:lvl>
     <w:lvl w:ilvl="2" w:tentative="1">
       <w:start w:val="1"/>
-      <w:numFmt w:val="bullet"/>
-      <w:lvlText w:val=""/>
+      <w:numFmt w:val="decimal"/>
+      <w:lvlText w:val="%3."/>
       <w:lvlJc w:val="left"/>
       <w:pPr>
         <w:tabs>
@@ -6188,15 +6164,11 @@
         </w:tabs>
         <w:ind w:left="2160" w:hanging="360"/>
       </w:pPr>
-      <w:rPr>
-        <w:rFonts w:ascii="Wingdings" w:hAnsi="Wingdings" w:hint="default"/>
-        <w:sz w:val="20"/>
-      </w:rPr>
     </w:lvl>
     <w:lvl w:ilvl="3" w:tentative="1">
       <w:start w:val="1"/>
-      <w:numFmt w:val="bullet"/>
-      <w:lvlText w:val=""/>
+      <w:numFmt w:val="decimal"/>
+      <w:lvlText w:val="%4."/>
       <w:lvlJc w:val="left"/>
       <w:pPr>
         <w:tabs>
@@ -6204,15 +6176,11 @@
         </w:tabs>
         <w:ind w:left="2880" w:hanging="360"/>
       </w:pPr>
-      <w:rPr>
-        <w:rFonts w:ascii="Wingdings" w:hAnsi="Wingdings" w:hint="default"/>
-        <w:sz w:val="20"/>
-      </w:rPr>
     </w:lvl>
     <w:lvl w:ilvl="4" w:tentative="1">
       <w:start w:val="1"/>
-      <w:numFmt w:val="bullet"/>
-      <w:lvlText w:val=""/>
+      <w:numFmt w:val="decimal"/>
+      <w:lvlText w:val="%5."/>
       <w:lvlJc w:val="left"/>
       <w:pPr>
         <w:tabs>
@@ -6220,15 +6188,11 @@
         </w:tabs>
         <w:ind w:left="3600" w:hanging="360"/>
       </w:pPr>
-      <w:rPr>
-        <w:rFonts w:ascii="Wingdings" w:hAnsi="Wingdings" w:hint="default"/>
-        <w:sz w:val="20"/>
-      </w:rPr>
     </w:lvl>
     <w:lvl w:ilvl="5" w:tentative="1">
       <w:start w:val="1"/>
-      <w:numFmt w:val="bullet"/>
-      <w:lvlText w:val=""/>
+      <w:numFmt w:val="decimal"/>
+      <w:lvlText w:val="%6."/>
       <w:lvlJc w:val="left"/>
       <w:pPr>
         <w:tabs>
@@ -6236,15 +6200,11 @@
         </w:tabs>
         <w:ind w:left="4320" w:hanging="360"/>
       </w:pPr>
-      <w:rPr>
-        <w:rFonts w:ascii="Wingdings" w:hAnsi="Wingdings" w:hint="default"/>
-        <w:sz w:val="20"/>
-      </w:rPr>
     </w:lvl>
     <w:lvl w:ilvl="6" w:tentative="1">
       <w:start w:val="1"/>
-      <w:numFmt w:val="bullet"/>
-      <w:lvlText w:val=""/>
+      <w:numFmt w:val="decimal"/>
+      <w:lvlText w:val="%7."/>
       <w:lvlJc w:val="left"/>
       <w:pPr>
         <w:tabs>
@@ -6252,15 +6212,11 @@
         </w:tabs>
         <w:ind w:left="5040" w:hanging="360"/>
       </w:pPr>
-      <w:rPr>
-        <w:rFonts w:ascii="Wingdings" w:hAnsi="Wingdings" w:hint="default"/>
-        <w:sz w:val="20"/>
-      </w:rPr>
     </w:lvl>
     <w:lvl w:ilvl="7" w:tentative="1">
       <w:start w:val="1"/>
-      <w:numFmt w:val="bullet"/>
-      <w:lvlText w:val=""/>
+      <w:numFmt w:val="decimal"/>
+      <w:lvlText w:val="%8."/>
       <w:lvlJc w:val="left"/>
       <w:pPr>
         <w:tabs>
@@ -6268,15 +6224,11 @@
         </w:tabs>
         <w:ind w:left="5760" w:hanging="360"/>
       </w:pPr>
-      <w:rPr>
-        <w:rFonts w:ascii="Wingdings" w:hAnsi="Wingdings" w:hint="default"/>
-        <w:sz w:val="20"/>
-      </w:rPr>
     </w:lvl>
     <w:lvl w:ilvl="8" w:tentative="1">
       <w:start w:val="1"/>
-      <w:numFmt w:val="bullet"/>
-      <w:lvlText w:val=""/>
+      <w:numFmt w:val="decimal"/>
+      <w:lvlText w:val="%9."/>
       <w:lvlJc w:val="left"/>
       <w:pPr>
         <w:tabs>
@@ -6284,16 +6236,12 @@
         </w:tabs>
         <w:ind w:left="6480" w:hanging="360"/>
       </w:pPr>
-      <w:rPr>
-        <w:rFonts w:ascii="Wingdings" w:hAnsi="Wingdings" w:hint="default"/>
-        <w:sz w:val="20"/>
-      </w:rPr>
     </w:lvl>
   </w:abstractNum>
   <w:abstractNum w:abstractNumId="13" w15:restartNumberingAfterBreak="0">
-    <w:nsid w:val="2F755FCF"/>
+    <w:nsid w:val="392D352B"/>
     <w:multiLevelType w:val="multilevel"/>
-    <w:tmpl w:val="B3E4A492"/>
+    <w:tmpl w:val="BD563CAC"/>
     <w:lvl w:ilvl="0">
       <w:start w:val="1"/>
       <w:numFmt w:val="decimal"/>
@@ -6404,13 +6352,13 @@
     </w:lvl>
   </w:abstractNum>
   <w:abstractNum w:abstractNumId="14" w15:restartNumberingAfterBreak="0">
-    <w:nsid w:val="3B7360DE"/>
+    <w:nsid w:val="3AFB5C01"/>
     <w:multiLevelType w:val="multilevel"/>
-    <w:tmpl w:val="F092C210"/>
+    <w:tmpl w:val="B4D83E64"/>
     <w:lvl w:ilvl="0">
       <w:start w:val="1"/>
-      <w:numFmt w:val="decimal"/>
-      <w:lvlText w:val="%1."/>
+      <w:numFmt w:val="bullet"/>
+      <w:lvlText w:val=""/>
       <w:lvlJc w:val="left"/>
       <w:pPr>
         <w:tabs>
@@ -6418,11 +6366,15 @@
         </w:tabs>
         <w:ind w:left="720" w:hanging="360"/>
       </w:pPr>
+      <w:rPr>
+        <w:rFonts w:ascii="Symbol" w:hAnsi="Symbol" w:hint="default"/>
+        <w:sz w:val="20"/>
+      </w:rPr>
     </w:lvl>
     <w:lvl w:ilvl="1" w:tentative="1">
       <w:start w:val="1"/>
-      <w:numFmt w:val="decimal"/>
-      <w:lvlText w:val="%2."/>
+      <w:numFmt w:val="bullet"/>
+      <w:lvlText w:val="o"/>
       <w:lvlJc w:val="left"/>
       <w:pPr>
         <w:tabs>
@@ -6430,11 +6382,15 @@
         </w:tabs>
         <w:ind w:left="1440" w:hanging="360"/>
       </w:pPr>
+      <w:rPr>
+        <w:rFonts w:ascii="Courier New" w:hAnsi="Courier New" w:hint="default"/>
+        <w:sz w:val="20"/>
+      </w:rPr>
     </w:lvl>
     <w:lvl w:ilvl="2" w:tentative="1">
       <w:start w:val="1"/>
-      <w:numFmt w:val="decimal"/>
-      <w:lvlText w:val="%3."/>
+      <w:numFmt w:val="bullet"/>
+      <w:lvlText w:val=""/>
       <w:lvlJc w:val="left"/>
       <w:pPr>
         <w:tabs>
@@ -6442,11 +6398,15 @@
         </w:tabs>
         <w:ind w:left="2160" w:hanging="360"/>
       </w:pPr>
+      <w:rPr>
+        <w:rFonts w:ascii="Wingdings" w:hAnsi="Wingdings" w:hint="default"/>
+        <w:sz w:val="20"/>
+      </w:rPr>
     </w:lvl>
     <w:lvl w:ilvl="3" w:tentative="1">
       <w:start w:val="1"/>
-      <w:numFmt w:val="decimal"/>
-      <w:lvlText w:val="%4."/>
+      <w:numFmt w:val="bullet"/>
+      <w:lvlText w:val=""/>
       <w:lvlJc w:val="left"/>
       <w:pPr>
         <w:tabs>
@@ -6454,11 +6414,15 @@
         </w:tabs>
         <w:ind w:left="2880" w:hanging="360"/>
       </w:pPr>
+      <w:rPr>
+        <w:rFonts w:ascii="Wingdings" w:hAnsi="Wingdings" w:hint="default"/>
+        <w:sz w:val="20"/>
+      </w:rPr>
     </w:lvl>
     <w:lvl w:ilvl="4" w:tentative="1">
       <w:start w:val="1"/>
-      <w:numFmt w:val="decimal"/>
-      <w:lvlText w:val="%5."/>
+      <w:numFmt w:val="bullet"/>
+      <w:lvlText w:val=""/>
       <w:lvlJc w:val="left"/>
       <w:pPr>
         <w:tabs>
@@ -6466,11 +6430,15 @@
         </w:tabs>
         <w:ind w:left="3600" w:hanging="360"/>
       </w:pPr>
+      <w:rPr>
+        <w:rFonts w:ascii="Wingdings" w:hAnsi="Wingdings" w:hint="default"/>
+        <w:sz w:val="20"/>
+      </w:rPr>
     </w:lvl>
     <w:lvl w:ilvl="5" w:tentative="1">
       <w:start w:val="1"/>
-      <w:numFmt w:val="decimal"/>
-      <w:lvlText w:val="%6."/>
+      <w:numFmt w:val="bullet"/>
+      <w:lvlText w:val=""/>
       <w:lvlJc w:val="left"/>
       <w:pPr>
         <w:tabs>
@@ -6478,11 +6446,15 @@
         </w:tabs>
         <w:ind w:left="4320" w:hanging="360"/>
       </w:pPr>
+      <w:rPr>
+        <w:rFonts w:ascii="Wingdings" w:hAnsi="Wingdings" w:hint="default"/>
+        <w:sz w:val="20"/>
+      </w:rPr>
     </w:lvl>
     <w:lvl w:ilvl="6" w:tentative="1">
       <w:start w:val="1"/>
-      <w:numFmt w:val="decimal"/>
-      <w:lvlText w:val="%7."/>
+      <w:numFmt w:val="bullet"/>
+      <w:lvlText w:val=""/>
       <w:lvlJc w:val="left"/>
       <w:pPr>
         <w:tabs>
@@ -6490,11 +6462,15 @@
         </w:tabs>
         <w:ind w:left="5040" w:hanging="360"/>
       </w:pPr>
+      <w:rPr>
+        <w:rFonts w:ascii="Wingdings" w:hAnsi="Wingdings" w:hint="default"/>
+        <w:sz w:val="20"/>
+      </w:rPr>
     </w:lvl>
     <w:lvl w:ilvl="7" w:tentative="1">
       <w:start w:val="1"/>
-      <w:numFmt w:val="decimal"/>
-      <w:lvlText w:val="%8."/>
+      <w:numFmt w:val="bullet"/>
+      <w:lvlText w:val=""/>
       <w:lvlJc w:val="left"/>
       <w:pPr>
         <w:tabs>
@@ -6502,11 +6478,15 @@
         </w:tabs>
         <w:ind w:left="5760" w:hanging="360"/>
       </w:pPr>
+      <w:rPr>
+        <w:rFonts w:ascii="Wingdings" w:hAnsi="Wingdings" w:hint="default"/>
+        <w:sz w:val="20"/>
+      </w:rPr>
     </w:lvl>
     <w:lvl w:ilvl="8" w:tentative="1">
       <w:start w:val="1"/>
-      <w:numFmt w:val="decimal"/>
-      <w:lvlText w:val="%9."/>
+      <w:numFmt w:val="bullet"/>
+      <w:lvlText w:val=""/>
       <w:lvlJc w:val="left"/>
       <w:pPr>
         <w:tabs>
@@ -6514,16 +6494,20 @@
         </w:tabs>
         <w:ind w:left="6480" w:hanging="360"/>
       </w:pPr>
+      <w:rPr>
+        <w:rFonts w:ascii="Wingdings" w:hAnsi="Wingdings" w:hint="default"/>
+        <w:sz w:val="20"/>
+      </w:rPr>
     </w:lvl>
   </w:abstractNum>
   <w:abstractNum w:abstractNumId="15" w15:restartNumberingAfterBreak="0">
-    <w:nsid w:val="3DA63CAE"/>
+    <w:nsid w:val="3CDE40BA"/>
     <w:multiLevelType w:val="multilevel"/>
-    <w:tmpl w:val="40CAEB60"/>
+    <w:tmpl w:val="D46244FA"/>
     <w:lvl w:ilvl="0">
       <w:start w:val="1"/>
-      <w:numFmt w:val="bullet"/>
-      <w:lvlText w:val=""/>
+      <w:numFmt w:val="decimal"/>
+      <w:lvlText w:val="%1."/>
       <w:lvlJc w:val="left"/>
       <w:pPr>
         <w:tabs>
@@ -6531,15 +6515,11 @@
         </w:tabs>
         <w:ind w:left="720" w:hanging="360"/>
       </w:pPr>
-      <w:rPr>
-        <w:rFonts w:ascii="Symbol" w:hAnsi="Symbol" w:hint="default"/>
-        <w:sz w:val="20"/>
-      </w:rPr>
     </w:lvl>
     <w:lvl w:ilvl="1" w:tentative="1">
       <w:start w:val="1"/>
-      <w:numFmt w:val="bullet"/>
-      <w:lvlText w:val="o"/>
+      <w:numFmt w:val="decimal"/>
+      <w:lvlText w:val="%2."/>
       <w:lvlJc w:val="left"/>
       <w:pPr>
         <w:tabs>
@@ -6547,15 +6527,11 @@
         </w:tabs>
         <w:ind w:left="1440" w:hanging="360"/>
       </w:pPr>
-      <w:rPr>
-        <w:rFonts w:ascii="Courier New" w:hAnsi="Courier New" w:hint="default"/>
-        <w:sz w:val="20"/>
-      </w:rPr>
     </w:lvl>
     <w:lvl w:ilvl="2" w:tentative="1">
       <w:start w:val="1"/>
-      <w:numFmt w:val="bullet"/>
-      <w:lvlText w:val=""/>
+      <w:numFmt w:val="decimal"/>
+      <w:lvlText w:val="%3."/>
       <w:lvlJc w:val="left"/>
       <w:pPr>
         <w:tabs>
@@ -6563,15 +6539,11 @@
         </w:tabs>
         <w:ind w:left="2160" w:hanging="360"/>
       </w:pPr>
-      <w:rPr>
-        <w:rFonts w:ascii="Wingdings" w:hAnsi="Wingdings" w:hint="default"/>
-        <w:sz w:val="20"/>
-      </w:rPr>
     </w:lvl>
     <w:lvl w:ilvl="3" w:tentative="1">
       <w:start w:val="1"/>
-      <w:numFmt w:val="bullet"/>
-      <w:lvlText w:val=""/>
+      <w:numFmt w:val="decimal"/>
+      <w:lvlText w:val="%4."/>
       <w:lvlJc w:val="left"/>
       <w:pPr>
         <w:tabs>
@@ -6579,15 +6551,11 @@
         </w:tabs>
         <w:ind w:left="2880" w:hanging="360"/>
       </w:pPr>
-      <w:rPr>
-        <w:rFonts w:ascii="Wingdings" w:hAnsi="Wingdings" w:hint="default"/>
-        <w:sz w:val="20"/>
-      </w:rPr>
     </w:lvl>
     <w:lvl w:ilvl="4" w:tentative="1">
       <w:start w:val="1"/>
-      <w:numFmt w:val="bullet"/>
-      <w:lvlText w:val=""/>
+      <w:numFmt w:val="decimal"/>
+      <w:lvlText w:val="%5."/>
       <w:lvlJc w:val="left"/>
       <w:pPr>
         <w:tabs>
@@ -6595,15 +6563,11 @@
         </w:tabs>
         <w:ind w:left="3600" w:hanging="360"/>
       </w:pPr>
-      <w:rPr>
-        <w:rFonts w:ascii="Wingdings" w:hAnsi="Wingdings" w:hint="default"/>
-        <w:sz w:val="20"/>
-      </w:rPr>
     </w:lvl>
     <w:lvl w:ilvl="5" w:tentative="1">
       <w:start w:val="1"/>
-      <w:numFmt w:val="bullet"/>
-      <w:lvlText w:val=""/>
+      <w:numFmt w:val="decimal"/>
+      <w:lvlText w:val="%6."/>
       <w:lvlJc w:val="left"/>
       <w:pPr>
         <w:tabs>
@@ -6611,15 +6575,11 @@
         </w:tabs>
         <w:ind w:left="4320" w:hanging="360"/>
       </w:pPr>
-      <w:rPr>
-        <w:rFonts w:ascii="Wingdings" w:hAnsi="Wingdings" w:hint="default"/>
-        <w:sz w:val="20"/>
-      </w:rPr>
     </w:lvl>
     <w:lvl w:ilvl="6" w:tentative="1">
       <w:start w:val="1"/>
-      <w:numFmt w:val="bullet"/>
-      <w:lvlText w:val=""/>
+      <w:numFmt w:val="decimal"/>
+      <w:lvlText w:val="%7."/>
       <w:lvlJc w:val="left"/>
       <w:pPr>
         <w:tabs>
@@ -6627,15 +6587,11 @@
         </w:tabs>
         <w:ind w:left="5040" w:hanging="360"/>
       </w:pPr>
-      <w:rPr>
-        <w:rFonts w:ascii="Wingdings" w:hAnsi="Wingdings" w:hint="default"/>
-        <w:sz w:val="20"/>
-      </w:rPr>
     </w:lvl>
     <w:lvl w:ilvl="7" w:tentative="1">
       <w:start w:val="1"/>
-      <w:numFmt w:val="bullet"/>
-      <w:lvlText w:val=""/>
+      <w:numFmt w:val="decimal"/>
+      <w:lvlText w:val="%8."/>
       <w:lvlJc w:val="left"/>
       <w:pPr>
         <w:tabs>
@@ -6643,15 +6599,11 @@
         </w:tabs>
         <w:ind w:left="5760" w:hanging="360"/>
       </w:pPr>
-      <w:rPr>
-        <w:rFonts w:ascii="Wingdings" w:hAnsi="Wingdings" w:hint="default"/>
-        <w:sz w:val="20"/>
-      </w:rPr>
     </w:lvl>
     <w:lvl w:ilvl="8" w:tentative="1">
       <w:start w:val="1"/>
-      <w:numFmt w:val="bullet"/>
-      <w:lvlText w:val=""/>
+      <w:numFmt w:val="decimal"/>
+      <w:lvlText w:val="%9."/>
       <w:lvlJc w:val="left"/>
       <w:pPr>
         <w:tabs>
@@ -6659,16 +6611,12 @@
         </w:tabs>
         <w:ind w:left="6480" w:hanging="360"/>
       </w:pPr>
-      <w:rPr>
-        <w:rFonts w:ascii="Wingdings" w:hAnsi="Wingdings" w:hint="default"/>
-        <w:sz w:val="20"/>
-      </w:rPr>
     </w:lvl>
   </w:abstractNum>
   <w:abstractNum w:abstractNumId="16" w15:restartNumberingAfterBreak="0">
-    <w:nsid w:val="40C33635"/>
+    <w:nsid w:val="3F514C47"/>
     <w:multiLevelType w:val="multilevel"/>
-    <w:tmpl w:val="93D4D11A"/>
+    <w:tmpl w:val="0A0CC99E"/>
     <w:lvl w:ilvl="0">
       <w:start w:val="1"/>
       <w:numFmt w:val="decimal"/>
@@ -6779,9 +6727,9 @@
     </w:lvl>
   </w:abstractNum>
   <w:abstractNum w:abstractNumId="17" w15:restartNumberingAfterBreak="0">
-    <w:nsid w:val="423A7A69"/>
+    <w:nsid w:val="402334B5"/>
     <w:multiLevelType w:val="multilevel"/>
-    <w:tmpl w:val="E36433B8"/>
+    <w:tmpl w:val="8E1680A2"/>
     <w:lvl w:ilvl="0">
       <w:start w:val="1"/>
       <w:numFmt w:val="bullet"/>
@@ -6928,9 +6876,9 @@
     </w:lvl>
   </w:abstractNum>
   <w:abstractNum w:abstractNumId="18" w15:restartNumberingAfterBreak="0">
-    <w:nsid w:val="47AE26D9"/>
+    <w:nsid w:val="42A214FF"/>
     <w:multiLevelType w:val="multilevel"/>
-    <w:tmpl w:val="FC5ABC90"/>
+    <w:tmpl w:val="3BE06DA4"/>
     <w:lvl w:ilvl="0">
       <w:start w:val="1"/>
       <w:numFmt w:val="bullet"/>
@@ -7077,9 +7025,9 @@
     </w:lvl>
   </w:abstractNum>
   <w:abstractNum w:abstractNumId="19" w15:restartNumberingAfterBreak="0">
-    <w:nsid w:val="51142D8D"/>
+    <w:nsid w:val="47026AB6"/>
     <w:multiLevelType w:val="multilevel"/>
-    <w:tmpl w:val="732826C4"/>
+    <w:tmpl w:val="4754DF46"/>
     <w:lvl w:ilvl="0">
       <w:start w:val="1"/>
       <w:numFmt w:val="decimal"/>
@@ -7190,13 +7138,13 @@
     </w:lvl>
   </w:abstractNum>
   <w:abstractNum w:abstractNumId="20" w15:restartNumberingAfterBreak="0">
-    <w:nsid w:val="51C40B8D"/>
+    <w:nsid w:val="4EEE43FC"/>
     <w:multiLevelType w:val="multilevel"/>
-    <w:tmpl w:val="AF409AF0"/>
+    <w:tmpl w:val="9800B666"/>
     <w:lvl w:ilvl="0">
       <w:start w:val="1"/>
-      <w:numFmt w:val="bullet"/>
-      <w:lvlText w:val=""/>
+      <w:numFmt w:val="decimal"/>
+      <w:lvlText w:val="%1."/>
       <w:lvlJc w:val="left"/>
       <w:pPr>
         <w:tabs>
@@ -7204,15 +7152,11 @@
         </w:tabs>
         <w:ind w:left="720" w:hanging="360"/>
       </w:pPr>
-      <w:rPr>
-        <w:rFonts w:ascii="Symbol" w:hAnsi="Symbol" w:hint="default"/>
-        <w:sz w:val="20"/>
-      </w:rPr>
     </w:lvl>
     <w:lvl w:ilvl="1" w:tentative="1">
       <w:start w:val="1"/>
-      <w:numFmt w:val="bullet"/>
-      <w:lvlText w:val="o"/>
+      <w:numFmt w:val="decimal"/>
+      <w:lvlText w:val="%2."/>
       <w:lvlJc w:val="left"/>
       <w:pPr>
         <w:tabs>
@@ -7220,15 +7164,11 @@
         </w:tabs>
         <w:ind w:left="1440" w:hanging="360"/>
       </w:pPr>
-      <w:rPr>
-        <w:rFonts w:ascii="Courier New" w:hAnsi="Courier New" w:hint="default"/>
-        <w:sz w:val="20"/>
-      </w:rPr>
     </w:lvl>
     <w:lvl w:ilvl="2" w:tentative="1">
       <w:start w:val="1"/>
-      <w:numFmt w:val="bullet"/>
-      <w:lvlText w:val=""/>
+      <w:numFmt w:val="decimal"/>
+      <w:lvlText w:val="%3."/>
       <w:lvlJc w:val="left"/>
       <w:pPr>
         <w:tabs>
@@ -7236,15 +7176,11 @@
         </w:tabs>
         <w:ind w:left="2160" w:hanging="360"/>
       </w:pPr>
-      <w:rPr>
-        <w:rFonts w:ascii="Wingdings" w:hAnsi="Wingdings" w:hint="default"/>
-        <w:sz w:val="20"/>
-      </w:rPr>
     </w:lvl>
     <w:lvl w:ilvl="3" w:tentative="1">
       <w:start w:val="1"/>
-      <w:numFmt w:val="bullet"/>
-      <w:lvlText w:val=""/>
+      <w:numFmt w:val="decimal"/>
+      <w:lvlText w:val="%4."/>
       <w:lvlJc w:val="left"/>
       <w:pPr>
         <w:tabs>
@@ -7252,15 +7188,11 @@
         </w:tabs>
         <w:ind w:left="2880" w:hanging="360"/>
       </w:pPr>
-      <w:rPr>
-        <w:rFonts w:ascii="Wingdings" w:hAnsi="Wingdings" w:hint="default"/>
-        <w:sz w:val="20"/>
-      </w:rPr>
     </w:lvl>
     <w:lvl w:ilvl="4" w:tentative="1">
       <w:start w:val="1"/>
-      <w:numFmt w:val="bullet"/>
-      <w:lvlText w:val=""/>
+      <w:numFmt w:val="decimal"/>
+      <w:lvlText w:val="%5."/>
       <w:lvlJc w:val="left"/>
       <w:pPr>
         <w:tabs>
@@ -7268,15 +7200,11 @@
         </w:tabs>
         <w:ind w:left="3600" w:hanging="360"/>
       </w:pPr>
-      <w:rPr>
-        <w:rFonts w:ascii="Wingdings" w:hAnsi="Wingdings" w:hint="default"/>
-        <w:sz w:val="20"/>
-      </w:rPr>
     </w:lvl>
     <w:lvl w:ilvl="5" w:tentative="1">
       <w:start w:val="1"/>
-      <w:numFmt w:val="bullet"/>
-      <w:lvlText w:val=""/>
+      <w:numFmt w:val="decimal"/>
+      <w:lvlText w:val="%6."/>
       <w:lvlJc w:val="left"/>
       <w:pPr>
         <w:tabs>
@@ -7284,15 +7212,11 @@
         </w:tabs>
         <w:ind w:left="4320" w:hanging="360"/>
       </w:pPr>
-      <w:rPr>
-        <w:rFonts w:ascii="Wingdings" w:hAnsi="Wingdings" w:hint="default"/>
-        <w:sz w:val="20"/>
-      </w:rPr>
     </w:lvl>
     <w:lvl w:ilvl="6" w:tentative="1">
       <w:start w:val="1"/>
-      <w:numFmt w:val="bullet"/>
-      <w:lvlText w:val=""/>
+      <w:numFmt w:val="decimal"/>
+      <w:lvlText w:val="%7."/>
       <w:lvlJc w:val="left"/>
       <w:pPr>
         <w:tabs>
@@ -7300,15 +7224,11 @@
         </w:tabs>
         <w:ind w:left="5040" w:hanging="360"/>
       </w:pPr>
-      <w:rPr>
-        <w:rFonts w:ascii="Wingdings" w:hAnsi="Wingdings" w:hint="default"/>
-        <w:sz w:val="20"/>
-      </w:rPr>
     </w:lvl>
     <w:lvl w:ilvl="7" w:tentative="1">
       <w:start w:val="1"/>
-      <w:numFmt w:val="bullet"/>
-      <w:lvlText w:val=""/>
+      <w:numFmt w:val="decimal"/>
+      <w:lvlText w:val="%8."/>
       <w:lvlJc w:val="left"/>
       <w:pPr>
         <w:tabs>
@@ -7316,15 +7236,11 @@
         </w:tabs>
         <w:ind w:left="5760" w:hanging="360"/>
       </w:pPr>
-      <w:rPr>
-        <w:rFonts w:ascii="Wingdings" w:hAnsi="Wingdings" w:hint="default"/>
-        <w:sz w:val="20"/>
-      </w:rPr>
     </w:lvl>
     <w:lvl w:ilvl="8" w:tentative="1">
       <w:start w:val="1"/>
-      <w:numFmt w:val="bullet"/>
-      <w:lvlText w:val=""/>
+      <w:numFmt w:val="decimal"/>
+      <w:lvlText w:val="%9."/>
       <w:lvlJc w:val="left"/>
       <w:pPr>
         <w:tabs>
@@ -7332,20 +7248,16 @@
         </w:tabs>
         <w:ind w:left="6480" w:hanging="360"/>
       </w:pPr>
-      <w:rPr>
-        <w:rFonts w:ascii="Wingdings" w:hAnsi="Wingdings" w:hint="default"/>
-        <w:sz w:val="20"/>
-      </w:rPr>
     </w:lvl>
   </w:abstractNum>
   <w:abstractNum w:abstractNumId="21" w15:restartNumberingAfterBreak="0">
-    <w:nsid w:val="557827ED"/>
+    <w:nsid w:val="4FBB11C1"/>
     <w:multiLevelType w:val="multilevel"/>
-    <w:tmpl w:val="EA4E58E2"/>
+    <w:tmpl w:val="87CAE5B2"/>
     <w:lvl w:ilvl="0">
       <w:start w:val="1"/>
-      <w:numFmt w:val="decimal"/>
-      <w:lvlText w:val="%1."/>
+      <w:numFmt w:val="bullet"/>
+      <w:lvlText w:val=""/>
       <w:lvlJc w:val="left"/>
       <w:pPr>
         <w:tabs>
@@ -7353,11 +7265,15 @@
         </w:tabs>
         <w:ind w:left="720" w:hanging="360"/>
       </w:pPr>
+      <w:rPr>
+        <w:rFonts w:ascii="Symbol" w:hAnsi="Symbol" w:hint="default"/>
+        <w:sz w:val="20"/>
+      </w:rPr>
     </w:lvl>
     <w:lvl w:ilvl="1" w:tentative="1">
       <w:start w:val="1"/>
-      <w:numFmt w:val="decimal"/>
-      <w:lvlText w:val="%2."/>
+      <w:numFmt w:val="bullet"/>
+      <w:lvlText w:val="o"/>
       <w:lvlJc w:val="left"/>
       <w:pPr>
         <w:tabs>
@@ -7365,11 +7281,15 @@
         </w:tabs>
         <w:ind w:left="1440" w:hanging="360"/>
       </w:pPr>
+      <w:rPr>
+        <w:rFonts w:ascii="Courier New" w:hAnsi="Courier New" w:hint="default"/>
+        <w:sz w:val="20"/>
+      </w:rPr>
     </w:lvl>
     <w:lvl w:ilvl="2" w:tentative="1">
       <w:start w:val="1"/>
-      <w:numFmt w:val="decimal"/>
-      <w:lvlText w:val="%3."/>
+      <w:numFmt w:val="bullet"/>
+      <w:lvlText w:val=""/>
       <w:lvlJc w:val="left"/>
       <w:pPr>
         <w:tabs>
@@ -7377,11 +7297,15 @@
         </w:tabs>
         <w:ind w:left="2160" w:hanging="360"/>
       </w:pPr>
+      <w:rPr>
+        <w:rFonts w:ascii="Wingdings" w:hAnsi="Wingdings" w:hint="default"/>
+        <w:sz w:val="20"/>
+      </w:rPr>
     </w:lvl>
     <w:lvl w:ilvl="3" w:tentative="1">
       <w:start w:val="1"/>
-      <w:numFmt w:val="decimal"/>
-      <w:lvlText w:val="%4."/>
+      <w:numFmt w:val="bullet"/>
+      <w:lvlText w:val=""/>
       <w:lvlJc w:val="left"/>
       <w:pPr>
         <w:tabs>
@@ -7389,11 +7313,15 @@
         </w:tabs>
         <w:ind w:left="2880" w:hanging="360"/>
       </w:pPr>
+      <w:rPr>
+        <w:rFonts w:ascii="Wingdings" w:hAnsi="Wingdings" w:hint="default"/>
+        <w:sz w:val="20"/>
+      </w:rPr>
     </w:lvl>
     <w:lvl w:ilvl="4" w:tentative="1">
       <w:start w:val="1"/>
-      <w:numFmt w:val="decimal"/>
-      <w:lvlText w:val="%5."/>
+      <w:numFmt w:val="bullet"/>
+      <w:lvlText w:val=""/>
       <w:lvlJc w:val="left"/>
       <w:pPr>
         <w:tabs>
@@ -7401,11 +7329,15 @@
         </w:tabs>
         <w:ind w:left="3600" w:hanging="360"/>
       </w:pPr>
+      <w:rPr>
+        <w:rFonts w:ascii="Wingdings" w:hAnsi="Wingdings" w:hint="default"/>
+        <w:sz w:val="20"/>
+      </w:rPr>
     </w:lvl>
     <w:lvl w:ilvl="5" w:tentative="1">
       <w:start w:val="1"/>
-      <w:numFmt w:val="decimal"/>
-      <w:lvlText w:val="%6."/>
+      <w:numFmt w:val="bullet"/>
+      <w:lvlText w:val=""/>
       <w:lvlJc w:val="left"/>
       <w:pPr>
         <w:tabs>
@@ -7413,11 +7345,15 @@
         </w:tabs>
         <w:ind w:left="4320" w:hanging="360"/>
       </w:pPr>
+      <w:rPr>
+        <w:rFonts w:ascii="Wingdings" w:hAnsi="Wingdings" w:hint="default"/>
+        <w:sz w:val="20"/>
+      </w:rPr>
     </w:lvl>
     <w:lvl w:ilvl="6" w:tentative="1">
       <w:start w:val="1"/>
-      <w:numFmt w:val="decimal"/>
-      <w:lvlText w:val="%7."/>
+      <w:numFmt w:val="bullet"/>
+      <w:lvlText w:val=""/>
       <w:lvlJc w:val="left"/>
       <w:pPr>
         <w:tabs>
@@ -7425,11 +7361,15 @@
         </w:tabs>
         <w:ind w:left="5040" w:hanging="360"/>
       </w:pPr>
+      <w:rPr>
+        <w:rFonts w:ascii="Wingdings" w:hAnsi="Wingdings" w:hint="default"/>
+        <w:sz w:val="20"/>
+      </w:rPr>
     </w:lvl>
     <w:lvl w:ilvl="7" w:tentative="1">
       <w:start w:val="1"/>
-      <w:numFmt w:val="decimal"/>
-      <w:lvlText w:val="%8."/>
+      <w:numFmt w:val="bullet"/>
+      <w:lvlText w:val=""/>
       <w:lvlJc w:val="left"/>
       <w:pPr>
         <w:tabs>
@@ -7437,11 +7377,15 @@
         </w:tabs>
         <w:ind w:left="5760" w:hanging="360"/>
       </w:pPr>
+      <w:rPr>
+        <w:rFonts w:ascii="Wingdings" w:hAnsi="Wingdings" w:hint="default"/>
+        <w:sz w:val="20"/>
+      </w:rPr>
     </w:lvl>
     <w:lvl w:ilvl="8" w:tentative="1">
       <w:start w:val="1"/>
-      <w:numFmt w:val="decimal"/>
-      <w:lvlText w:val="%9."/>
+      <w:numFmt w:val="bullet"/>
+      <w:lvlText w:val=""/>
       <w:lvlJc w:val="left"/>
       <w:pPr>
         <w:tabs>
@@ -7449,16 +7393,20 @@
         </w:tabs>
         <w:ind w:left="6480" w:hanging="360"/>
       </w:pPr>
+      <w:rPr>
+        <w:rFonts w:ascii="Wingdings" w:hAnsi="Wingdings" w:hint="default"/>
+        <w:sz w:val="20"/>
+      </w:rPr>
     </w:lvl>
   </w:abstractNum>
   <w:abstractNum w:abstractNumId="22" w15:restartNumberingAfterBreak="0">
-    <w:nsid w:val="58823303"/>
+    <w:nsid w:val="51945AFC"/>
     <w:multiLevelType w:val="multilevel"/>
-    <w:tmpl w:val="5B5E8B18"/>
+    <w:tmpl w:val="A446B648"/>
     <w:lvl w:ilvl="0">
       <w:start w:val="1"/>
-      <w:numFmt w:val="decimal"/>
-      <w:lvlText w:val="%1."/>
+      <w:numFmt w:val="bullet"/>
+      <w:lvlText w:val=""/>
       <w:lvlJc w:val="left"/>
       <w:pPr>
         <w:tabs>
@@ -7466,11 +7414,15 @@
         </w:tabs>
         <w:ind w:left="720" w:hanging="360"/>
       </w:pPr>
+      <w:rPr>
+        <w:rFonts w:ascii="Symbol" w:hAnsi="Symbol" w:hint="default"/>
+        <w:sz w:val="20"/>
+      </w:rPr>
     </w:lvl>
     <w:lvl w:ilvl="1" w:tentative="1">
       <w:start w:val="1"/>
-      <w:numFmt w:val="decimal"/>
-      <w:lvlText w:val="%2."/>
+      <w:numFmt w:val="bullet"/>
+      <w:lvlText w:val="o"/>
       <w:lvlJc w:val="left"/>
       <w:pPr>
         <w:tabs>
@@ -7478,11 +7430,15 @@
         </w:tabs>
         <w:ind w:left="1440" w:hanging="360"/>
       </w:pPr>
+      <w:rPr>
+        <w:rFonts w:ascii="Courier New" w:hAnsi="Courier New" w:hint="default"/>
+        <w:sz w:val="20"/>
+      </w:rPr>
     </w:lvl>
     <w:lvl w:ilvl="2" w:tentative="1">
       <w:start w:val="1"/>
-      <w:numFmt w:val="decimal"/>
-      <w:lvlText w:val="%3."/>
+      <w:numFmt w:val="bullet"/>
+      <w:lvlText w:val=""/>
       <w:lvlJc w:val="left"/>
       <w:pPr>
         <w:tabs>
@@ -7490,11 +7446,15 @@
         </w:tabs>
         <w:ind w:left="2160" w:hanging="360"/>
       </w:pPr>
+      <w:rPr>
+        <w:rFonts w:ascii="Wingdings" w:hAnsi="Wingdings" w:hint="default"/>
+        <w:sz w:val="20"/>
+      </w:rPr>
     </w:lvl>
     <w:lvl w:ilvl="3" w:tentative="1">
       <w:start w:val="1"/>
-      <w:numFmt w:val="decimal"/>
-      <w:lvlText w:val="%4."/>
+      <w:numFmt w:val="bullet"/>
+      <w:lvlText w:val=""/>
       <w:lvlJc w:val="left"/>
       <w:pPr>
         <w:tabs>
@@ -7502,11 +7462,15 @@
         </w:tabs>
         <w:ind w:left="2880" w:hanging="360"/>
       </w:pPr>
+      <w:rPr>
+        <w:rFonts w:ascii="Wingdings" w:hAnsi="Wingdings" w:hint="default"/>
+        <w:sz w:val="20"/>
+      </w:rPr>
     </w:lvl>
     <w:lvl w:ilvl="4" w:tentative="1">
       <w:start w:val="1"/>
-      <w:numFmt w:val="decimal"/>
-      <w:lvlText w:val="%5."/>
+      <w:numFmt w:val="bullet"/>
+      <w:lvlText w:val=""/>
       <w:lvlJc w:val="left"/>
       <w:pPr>
         <w:tabs>
@@ -7514,11 +7478,15 @@
         </w:tabs>
         <w:ind w:left="3600" w:hanging="360"/>
       </w:pPr>
+      <w:rPr>
+        <w:rFonts w:ascii="Wingdings" w:hAnsi="Wingdings" w:hint="default"/>
+        <w:sz w:val="20"/>
+      </w:rPr>
     </w:lvl>
     <w:lvl w:ilvl="5" w:tentative="1">
       <w:start w:val="1"/>
-      <w:numFmt w:val="decimal"/>
-      <w:lvlText w:val="%6."/>
+      <w:numFmt w:val="bullet"/>
+      <w:lvlText w:val=""/>
       <w:lvlJc w:val="left"/>
       <w:pPr>
         <w:tabs>
@@ -7526,11 +7494,15 @@
         </w:tabs>
         <w:ind w:left="4320" w:hanging="360"/>
       </w:pPr>
+      <w:rPr>
+        <w:rFonts w:ascii="Wingdings" w:hAnsi="Wingdings" w:hint="default"/>
+        <w:sz w:val="20"/>
+      </w:rPr>
     </w:lvl>
     <w:lvl w:ilvl="6" w:tentative="1">
       <w:start w:val="1"/>
-      <w:numFmt w:val="decimal"/>
-      <w:lvlText w:val="%7."/>
+      <w:numFmt w:val="bullet"/>
+      <w:lvlText w:val=""/>
       <w:lvlJc w:val="left"/>
       <w:pPr>
         <w:tabs>
@@ -7538,11 +7510,15 @@
         </w:tabs>
         <w:ind w:left="5040" w:hanging="360"/>
       </w:pPr>
+      <w:rPr>
+        <w:rFonts w:ascii="Wingdings" w:hAnsi="Wingdings" w:hint="default"/>
+        <w:sz w:val="20"/>
+      </w:rPr>
     </w:lvl>
     <w:lvl w:ilvl="7" w:tentative="1">
       <w:start w:val="1"/>
-      <w:numFmt w:val="decimal"/>
-      <w:lvlText w:val="%8."/>
+      <w:numFmt w:val="bullet"/>
+      <w:lvlText w:val=""/>
       <w:lvlJc w:val="left"/>
       <w:pPr>
         <w:tabs>
@@ -7550,11 +7526,15 @@
         </w:tabs>
         <w:ind w:left="5760" w:hanging="360"/>
       </w:pPr>
+      <w:rPr>
+        <w:rFonts w:ascii="Wingdings" w:hAnsi="Wingdings" w:hint="default"/>
+        <w:sz w:val="20"/>
+      </w:rPr>
     </w:lvl>
     <w:lvl w:ilvl="8" w:tentative="1">
       <w:start w:val="1"/>
-      <w:numFmt w:val="decimal"/>
-      <w:lvlText w:val="%9."/>
+      <w:numFmt w:val="bullet"/>
+      <w:lvlText w:val=""/>
       <w:lvlJc w:val="left"/>
       <w:pPr>
         <w:tabs>
@@ -7562,16 +7542,20 @@
         </w:tabs>
         <w:ind w:left="6480" w:hanging="360"/>
       </w:pPr>
+      <w:rPr>
+        <w:rFonts w:ascii="Wingdings" w:hAnsi="Wingdings" w:hint="default"/>
+        <w:sz w:val="20"/>
+      </w:rPr>
     </w:lvl>
   </w:abstractNum>
   <w:abstractNum w:abstractNumId="23" w15:restartNumberingAfterBreak="0">
-    <w:nsid w:val="5C0D1D15"/>
+    <w:nsid w:val="575A69A6"/>
     <w:multiLevelType w:val="multilevel"/>
-    <w:tmpl w:val="DCE021BE"/>
+    <w:tmpl w:val="BB66E9F2"/>
     <w:lvl w:ilvl="0">
       <w:start w:val="1"/>
-      <w:numFmt w:val="decimal"/>
-      <w:lvlText w:val="%1."/>
+      <w:numFmt w:val="bullet"/>
+      <w:lvlText w:val=""/>
       <w:lvlJc w:val="left"/>
       <w:pPr>
         <w:tabs>
@@ -7579,11 +7563,15 @@
         </w:tabs>
         <w:ind w:left="720" w:hanging="360"/>
       </w:pPr>
+      <w:rPr>
+        <w:rFonts w:ascii="Symbol" w:hAnsi="Symbol" w:hint="default"/>
+        <w:sz w:val="20"/>
+      </w:rPr>
     </w:lvl>
     <w:lvl w:ilvl="1" w:tentative="1">
       <w:start w:val="1"/>
-      <w:numFmt w:val="decimal"/>
-      <w:lvlText w:val="%2."/>
+      <w:numFmt w:val="bullet"/>
+      <w:lvlText w:val="o"/>
       <w:lvlJc w:val="left"/>
       <w:pPr>
         <w:tabs>
@@ -7591,11 +7579,15 @@
         </w:tabs>
         <w:ind w:left="1440" w:hanging="360"/>
       </w:pPr>
+      <w:rPr>
+        <w:rFonts w:ascii="Courier New" w:hAnsi="Courier New" w:hint="default"/>
+        <w:sz w:val="20"/>
+      </w:rPr>
     </w:lvl>
     <w:lvl w:ilvl="2" w:tentative="1">
       <w:start w:val="1"/>
-      <w:numFmt w:val="decimal"/>
-      <w:lvlText w:val="%3."/>
+      <w:numFmt w:val="bullet"/>
+      <w:lvlText w:val=""/>
       <w:lvlJc w:val="left"/>
       <w:pPr>
         <w:tabs>
@@ -7603,11 +7595,15 @@
         </w:tabs>
         <w:ind w:left="2160" w:hanging="360"/>
       </w:pPr>
+      <w:rPr>
+        <w:rFonts w:ascii="Wingdings" w:hAnsi="Wingdings" w:hint="default"/>
+        <w:sz w:val="20"/>
+      </w:rPr>
     </w:lvl>
     <w:lvl w:ilvl="3" w:tentative="1">
       <w:start w:val="1"/>
-      <w:numFmt w:val="decimal"/>
-      <w:lvlText w:val="%4."/>
+      <w:numFmt w:val="bullet"/>
+      <w:lvlText w:val=""/>
       <w:lvlJc w:val="left"/>
       <w:pPr>
         <w:tabs>
@@ -7615,11 +7611,15 @@
         </w:tabs>
         <w:ind w:left="2880" w:hanging="360"/>
       </w:pPr>
+      <w:rPr>
+        <w:rFonts w:ascii="Wingdings" w:hAnsi="Wingdings" w:hint="default"/>
+        <w:sz w:val="20"/>
+      </w:rPr>
     </w:lvl>
     <w:lvl w:ilvl="4" w:tentative="1">
       <w:start w:val="1"/>
-      <w:numFmt w:val="decimal"/>
-      <w:lvlText w:val="%5."/>
+      <w:numFmt w:val="bullet"/>
+      <w:lvlText w:val=""/>
       <w:lvlJc w:val="left"/>
       <w:pPr>
         <w:tabs>
@@ -7627,11 +7627,15 @@
         </w:tabs>
         <w:ind w:left="3600" w:hanging="360"/>
       </w:pPr>
+      <w:rPr>
+        <w:rFonts w:ascii="Wingdings" w:hAnsi="Wingdings" w:hint="default"/>
+        <w:sz w:val="20"/>
+      </w:rPr>
     </w:lvl>
     <w:lvl w:ilvl="5" w:tentative="1">
       <w:start w:val="1"/>
-      <w:numFmt w:val="decimal"/>
-      <w:lvlText w:val="%6."/>
+      <w:numFmt w:val="bullet"/>
+      <w:lvlText w:val=""/>
       <w:lvlJc w:val="left"/>
       <w:pPr>
         <w:tabs>
@@ -7639,11 +7643,15 @@
         </w:tabs>
         <w:ind w:left="4320" w:hanging="360"/>
       </w:pPr>
+      <w:rPr>
+        <w:rFonts w:ascii="Wingdings" w:hAnsi="Wingdings" w:hint="default"/>
+        <w:sz w:val="20"/>
+      </w:rPr>
     </w:lvl>
     <w:lvl w:ilvl="6" w:tentative="1">
       <w:start w:val="1"/>
-      <w:numFmt w:val="decimal"/>
-      <w:lvlText w:val="%7."/>
+      <w:numFmt w:val="bullet"/>
+      <w:lvlText w:val=""/>
       <w:lvlJc w:val="left"/>
       <w:pPr>
         <w:tabs>
@@ -7651,11 +7659,15 @@
         </w:tabs>
         <w:ind w:left="5040" w:hanging="360"/>
       </w:pPr>
+      <w:rPr>
+        <w:rFonts w:ascii="Wingdings" w:hAnsi="Wingdings" w:hint="default"/>
+        <w:sz w:val="20"/>
+      </w:rPr>
     </w:lvl>
     <w:lvl w:ilvl="7" w:tentative="1">
       <w:start w:val="1"/>
-      <w:numFmt w:val="decimal"/>
-      <w:lvlText w:val="%8."/>
+      <w:numFmt w:val="bullet"/>
+      <w:lvlText w:val=""/>
       <w:lvlJc w:val="left"/>
       <w:pPr>
         <w:tabs>
@@ -7663,11 +7675,15 @@
         </w:tabs>
         <w:ind w:left="5760" w:hanging="360"/>
       </w:pPr>
+      <w:rPr>
+        <w:rFonts w:ascii="Wingdings" w:hAnsi="Wingdings" w:hint="default"/>
+        <w:sz w:val="20"/>
+      </w:rPr>
     </w:lvl>
     <w:lvl w:ilvl="8" w:tentative="1">
       <w:start w:val="1"/>
-      <w:numFmt w:val="decimal"/>
-      <w:lvlText w:val="%9."/>
+      <w:numFmt w:val="bullet"/>
+      <w:lvlText w:val=""/>
       <w:lvlJc w:val="left"/>
       <w:pPr>
         <w:tabs>
@@ -7675,16 +7691,20 @@
         </w:tabs>
         <w:ind w:left="6480" w:hanging="360"/>
       </w:pPr>
+      <w:rPr>
+        <w:rFonts w:ascii="Wingdings" w:hAnsi="Wingdings" w:hint="default"/>
+        <w:sz w:val="20"/>
+      </w:rPr>
     </w:lvl>
   </w:abstractNum>
   <w:abstractNum w:abstractNumId="24" w15:restartNumberingAfterBreak="0">
-    <w:nsid w:val="5C7F3BDE"/>
+    <w:nsid w:val="579D6296"/>
     <w:multiLevelType w:val="multilevel"/>
-    <w:tmpl w:val="FAAC34A0"/>
+    <w:tmpl w:val="C412927A"/>
     <w:lvl w:ilvl="0">
       <w:start w:val="1"/>
-      <w:numFmt w:val="decimal"/>
-      <w:lvlText w:val="%1."/>
+      <w:numFmt w:val="bullet"/>
+      <w:lvlText w:val=""/>
       <w:lvlJc w:val="left"/>
       <w:pPr>
         <w:tabs>
@@ -7692,11 +7712,15 @@
         </w:tabs>
         <w:ind w:left="720" w:hanging="360"/>
       </w:pPr>
+      <w:rPr>
+        <w:rFonts w:ascii="Symbol" w:hAnsi="Symbol" w:hint="default"/>
+        <w:sz w:val="20"/>
+      </w:rPr>
     </w:lvl>
     <w:lvl w:ilvl="1" w:tentative="1">
       <w:start w:val="1"/>
-      <w:numFmt w:val="decimal"/>
-      <w:lvlText w:val="%2."/>
+      <w:numFmt w:val="bullet"/>
+      <w:lvlText w:val="o"/>
       <w:lvlJc w:val="left"/>
       <w:pPr>
         <w:tabs>
@@ -7704,11 +7728,15 @@
         </w:tabs>
         <w:ind w:left="1440" w:hanging="360"/>
       </w:pPr>
+      <w:rPr>
+        <w:rFonts w:ascii="Courier New" w:hAnsi="Courier New" w:hint="default"/>
+        <w:sz w:val="20"/>
+      </w:rPr>
     </w:lvl>
     <w:lvl w:ilvl="2" w:tentative="1">
       <w:start w:val="1"/>
-      <w:numFmt w:val="decimal"/>
-      <w:lvlText w:val="%3."/>
+      <w:numFmt w:val="bullet"/>
+      <w:lvlText w:val=""/>
       <w:lvlJc w:val="left"/>
       <w:pPr>
         <w:tabs>
@@ -7716,11 +7744,15 @@
         </w:tabs>
         <w:ind w:left="2160" w:hanging="360"/>
       </w:pPr>
+      <w:rPr>
+        <w:rFonts w:ascii="Wingdings" w:hAnsi="Wingdings" w:hint="default"/>
+        <w:sz w:val="20"/>
+      </w:rPr>
     </w:lvl>
     <w:lvl w:ilvl="3" w:tentative="1">
       <w:start w:val="1"/>
-      <w:numFmt w:val="decimal"/>
-      <w:lvlText w:val="%4."/>
+      <w:numFmt w:val="bullet"/>
+      <w:lvlText w:val=""/>
       <w:lvlJc w:val="left"/>
       <w:pPr>
         <w:tabs>
@@ -7728,11 +7760,15 @@
         </w:tabs>
         <w:ind w:left="2880" w:hanging="360"/>
       </w:pPr>
+      <w:rPr>
+        <w:rFonts w:ascii="Wingdings" w:hAnsi="Wingdings" w:hint="default"/>
+        <w:sz w:val="20"/>
+      </w:rPr>
     </w:lvl>
     <w:lvl w:ilvl="4" w:tentative="1">
       <w:start w:val="1"/>
-      <w:numFmt w:val="decimal"/>
-      <w:lvlText w:val="%5."/>
+      <w:numFmt w:val="bullet"/>
+      <w:lvlText w:val=""/>
       <w:lvlJc w:val="left"/>
       <w:pPr>
         <w:tabs>
@@ -7740,11 +7776,15 @@
         </w:tabs>
         <w:ind w:left="3600" w:hanging="360"/>
       </w:pPr>
+      <w:rPr>
+        <w:rFonts w:ascii="Wingdings" w:hAnsi="Wingdings" w:hint="default"/>
+        <w:sz w:val="20"/>
+      </w:rPr>
     </w:lvl>
     <w:lvl w:ilvl="5" w:tentative="1">
       <w:start w:val="1"/>
-      <w:numFmt w:val="decimal"/>
-      <w:lvlText w:val="%6."/>
+      <w:numFmt w:val="bullet"/>
+      <w:lvlText w:val=""/>
       <w:lvlJc w:val="left"/>
       <w:pPr>
         <w:tabs>
@@ -7752,11 +7792,15 @@
         </w:tabs>
         <w:ind w:left="4320" w:hanging="360"/>
       </w:pPr>
+      <w:rPr>
+        <w:rFonts w:ascii="Wingdings" w:hAnsi="Wingdings" w:hint="default"/>
+        <w:sz w:val="20"/>
+      </w:rPr>
     </w:lvl>
     <w:lvl w:ilvl="6" w:tentative="1">
       <w:start w:val="1"/>
-      <w:numFmt w:val="decimal"/>
-      <w:lvlText w:val="%7."/>
+      <w:numFmt w:val="bullet"/>
+      <w:lvlText w:val=""/>
       <w:lvlJc w:val="left"/>
       <w:pPr>
         <w:tabs>
@@ -7764,11 +7808,15 @@
         </w:tabs>
         <w:ind w:left="5040" w:hanging="360"/>
       </w:pPr>
+      <w:rPr>
+        <w:rFonts w:ascii="Wingdings" w:hAnsi="Wingdings" w:hint="default"/>
+        <w:sz w:val="20"/>
+      </w:rPr>
     </w:lvl>
     <w:lvl w:ilvl="7" w:tentative="1">
       <w:start w:val="1"/>
-      <w:numFmt w:val="decimal"/>
-      <w:lvlText w:val="%8."/>
+      <w:numFmt w:val="bullet"/>
+      <w:lvlText w:val=""/>
       <w:lvlJc w:val="left"/>
       <w:pPr>
         <w:tabs>
@@ -7776,11 +7824,15 @@
         </w:tabs>
         <w:ind w:left="5760" w:hanging="360"/>
       </w:pPr>
+      <w:rPr>
+        <w:rFonts w:ascii="Wingdings" w:hAnsi="Wingdings" w:hint="default"/>
+        <w:sz w:val="20"/>
+      </w:rPr>
     </w:lvl>
     <w:lvl w:ilvl="8" w:tentative="1">
       <w:start w:val="1"/>
-      <w:numFmt w:val="decimal"/>
-      <w:lvlText w:val="%9."/>
+      <w:numFmt w:val="bullet"/>
+      <w:lvlText w:val=""/>
       <w:lvlJc w:val="left"/>
       <w:pPr>
         <w:tabs>
@@ -7788,16 +7840,20 @@
         </w:tabs>
         <w:ind w:left="6480" w:hanging="360"/>
       </w:pPr>
+      <w:rPr>
+        <w:rFonts w:ascii="Wingdings" w:hAnsi="Wingdings" w:hint="default"/>
+        <w:sz w:val="20"/>
+      </w:rPr>
     </w:lvl>
   </w:abstractNum>
   <w:abstractNum w:abstractNumId="25" w15:restartNumberingAfterBreak="0">
-    <w:nsid w:val="5D137A45"/>
+    <w:nsid w:val="57AA56B0"/>
     <w:multiLevelType w:val="multilevel"/>
-    <w:tmpl w:val="F5906162"/>
+    <w:tmpl w:val="B9F441BA"/>
     <w:lvl w:ilvl="0">
       <w:start w:val="1"/>
-      <w:numFmt w:val="bullet"/>
-      <w:lvlText w:val=""/>
+      <w:numFmt w:val="decimal"/>
+      <w:lvlText w:val="%1."/>
       <w:lvlJc w:val="left"/>
       <w:pPr>
         <w:tabs>
@@ -7805,15 +7861,11 @@
         </w:tabs>
         <w:ind w:left="720" w:hanging="360"/>
       </w:pPr>
-      <w:rPr>
-        <w:rFonts w:ascii="Symbol" w:hAnsi="Symbol" w:hint="default"/>
-        <w:sz w:val="20"/>
-      </w:rPr>
     </w:lvl>
     <w:lvl w:ilvl="1" w:tentative="1">
       <w:start w:val="1"/>
-      <w:numFmt w:val="bullet"/>
-      <w:lvlText w:val="o"/>
+      <w:numFmt w:val="decimal"/>
+      <w:lvlText w:val="%2."/>
       <w:lvlJc w:val="left"/>
       <w:pPr>
         <w:tabs>
@@ -7821,15 +7873,11 @@
         </w:tabs>
         <w:ind w:left="1440" w:hanging="360"/>
       </w:pPr>
-      <w:rPr>
-        <w:rFonts w:ascii="Courier New" w:hAnsi="Courier New" w:hint="default"/>
-        <w:sz w:val="20"/>
-      </w:rPr>
     </w:lvl>
     <w:lvl w:ilvl="2" w:tentative="1">
       <w:start w:val="1"/>
-      <w:numFmt w:val="bullet"/>
-      <w:lvlText w:val=""/>
+      <w:numFmt w:val="decimal"/>
+      <w:lvlText w:val="%3."/>
       <w:lvlJc w:val="left"/>
       <w:pPr>
         <w:tabs>
@@ -7837,15 +7885,11 @@
         </w:tabs>
         <w:ind w:left="2160" w:hanging="360"/>
       </w:pPr>
-      <w:rPr>
-        <w:rFonts w:ascii="Wingdings" w:hAnsi="Wingdings" w:hint="default"/>
-        <w:sz w:val="20"/>
-      </w:rPr>
     </w:lvl>
     <w:lvl w:ilvl="3" w:tentative="1">
       <w:start w:val="1"/>
-      <w:numFmt w:val="bullet"/>
-      <w:lvlText w:val=""/>
+      <w:numFmt w:val="decimal"/>
+      <w:lvlText w:val="%4."/>
       <w:lvlJc w:val="left"/>
       <w:pPr>
         <w:tabs>
@@ -7853,15 +7897,11 @@
         </w:tabs>
         <w:ind w:left="2880" w:hanging="360"/>
       </w:pPr>
-      <w:rPr>
-        <w:rFonts w:ascii="Wingdings" w:hAnsi="Wingdings" w:hint="default"/>
-        <w:sz w:val="20"/>
-      </w:rPr>
     </w:lvl>
     <w:lvl w:ilvl="4" w:tentative="1">
       <w:start w:val="1"/>
-      <w:numFmt w:val="bullet"/>
-      <w:lvlText w:val=""/>
+      <w:numFmt w:val="decimal"/>
+      <w:lvlText w:val="%5."/>
       <w:lvlJc w:val="left"/>
       <w:pPr>
         <w:tabs>
@@ -7869,15 +7909,11 @@
         </w:tabs>
         <w:ind w:left="3600" w:hanging="360"/>
       </w:pPr>
-      <w:rPr>
-        <w:rFonts w:ascii="Wingdings" w:hAnsi="Wingdings" w:hint="default"/>
-        <w:sz w:val="20"/>
-      </w:rPr>
     </w:lvl>
     <w:lvl w:ilvl="5" w:tentative="1">
       <w:start w:val="1"/>
-      <w:numFmt w:val="bullet"/>
-      <w:lvlText w:val=""/>
+      <w:numFmt w:val="decimal"/>
+      <w:lvlText w:val="%6."/>
       <w:lvlJc w:val="left"/>
       <w:pPr>
         <w:tabs>
@@ -7885,15 +7921,11 @@
         </w:tabs>
         <w:ind w:left="4320" w:hanging="360"/>
       </w:pPr>
-      <w:rPr>
-        <w:rFonts w:ascii="Wingdings" w:hAnsi="Wingdings" w:hint="default"/>
-        <w:sz w:val="20"/>
-      </w:rPr>
     </w:lvl>
     <w:lvl w:ilvl="6" w:tentative="1">
       <w:start w:val="1"/>
-      <w:numFmt w:val="bullet"/>
-      <w:lvlText w:val=""/>
+      <w:numFmt w:val="decimal"/>
+      <w:lvlText w:val="%7."/>
       <w:lvlJc w:val="left"/>
       <w:pPr>
         <w:tabs>
@@ -7901,15 +7933,11 @@
         </w:tabs>
         <w:ind w:left="5040" w:hanging="360"/>
       </w:pPr>
-      <w:rPr>
-        <w:rFonts w:ascii="Wingdings" w:hAnsi="Wingdings" w:hint="default"/>
-        <w:sz w:val="20"/>
-      </w:rPr>
     </w:lvl>
     <w:lvl w:ilvl="7" w:tentative="1">
       <w:start w:val="1"/>
-      <w:numFmt w:val="bullet"/>
-      <w:lvlText w:val=""/>
+      <w:numFmt w:val="decimal"/>
+      <w:lvlText w:val="%8."/>
       <w:lvlJc w:val="left"/>
       <w:pPr>
         <w:tabs>
@@ -7917,15 +7945,11 @@
         </w:tabs>
         <w:ind w:left="5760" w:hanging="360"/>
       </w:pPr>
-      <w:rPr>
-        <w:rFonts w:ascii="Wingdings" w:hAnsi="Wingdings" w:hint="default"/>
-        <w:sz w:val="20"/>
-      </w:rPr>
     </w:lvl>
     <w:lvl w:ilvl="8" w:tentative="1">
       <w:start w:val="1"/>
-      <w:numFmt w:val="bullet"/>
-      <w:lvlText w:val=""/>
+      <w:numFmt w:val="decimal"/>
+      <w:lvlText w:val="%9."/>
       <w:lvlJc w:val="left"/>
       <w:pPr>
         <w:tabs>
@@ -7933,16 +7957,12 @@
         </w:tabs>
         <w:ind w:left="6480" w:hanging="360"/>
       </w:pPr>
-      <w:rPr>
-        <w:rFonts w:ascii="Wingdings" w:hAnsi="Wingdings" w:hint="default"/>
-        <w:sz w:val="20"/>
-      </w:rPr>
     </w:lvl>
   </w:abstractNum>
   <w:abstractNum w:abstractNumId="26" w15:restartNumberingAfterBreak="0">
-    <w:nsid w:val="5D5021DD"/>
+    <w:nsid w:val="5AD0206E"/>
     <w:multiLevelType w:val="multilevel"/>
-    <w:tmpl w:val="9050B9D6"/>
+    <w:tmpl w:val="BC26967C"/>
     <w:lvl w:ilvl="0">
       <w:start w:val="1"/>
       <w:numFmt w:val="decimal"/>
@@ -8053,9 +8073,9 @@
     </w:lvl>
   </w:abstractNum>
   <w:abstractNum w:abstractNumId="27" w15:restartNumberingAfterBreak="0">
-    <w:nsid w:val="5DB827B6"/>
+    <w:nsid w:val="612C3108"/>
     <w:multiLevelType w:val="multilevel"/>
-    <w:tmpl w:val="51BCFA36"/>
+    <w:tmpl w:val="54C6AF7C"/>
     <w:lvl w:ilvl="0">
       <w:start w:val="1"/>
       <w:numFmt w:val="decimal"/>
@@ -8166,13 +8186,13 @@
     </w:lvl>
   </w:abstractNum>
   <w:abstractNum w:abstractNumId="28" w15:restartNumberingAfterBreak="0">
-    <w:nsid w:val="6B5B5C90"/>
+    <w:nsid w:val="65B805C3"/>
     <w:multiLevelType w:val="multilevel"/>
-    <w:tmpl w:val="8E2E0380"/>
+    <w:tmpl w:val="90FEC4FA"/>
     <w:lvl w:ilvl="0">
       <w:start w:val="1"/>
-      <w:numFmt w:val="decimal"/>
-      <w:lvlText w:val="%1."/>
+      <w:numFmt w:val="bullet"/>
+      <w:lvlText w:val=""/>
       <w:lvlJc w:val="left"/>
       <w:pPr>
         <w:tabs>
@@ -8180,11 +8200,15 @@
         </w:tabs>
         <w:ind w:left="720" w:hanging="360"/>
       </w:pPr>
+      <w:rPr>
+        <w:rFonts w:ascii="Symbol" w:hAnsi="Symbol" w:hint="default"/>
+        <w:sz w:val="20"/>
+      </w:rPr>
     </w:lvl>
     <w:lvl w:ilvl="1" w:tentative="1">
       <w:start w:val="1"/>
-      <w:numFmt w:val="decimal"/>
-      <w:lvlText w:val="%2."/>
+      <w:numFmt w:val="bullet"/>
+      <w:lvlText w:val="o"/>
       <w:lvlJc w:val="left"/>
       <w:pPr>
         <w:tabs>
@@ -8192,11 +8216,15 @@
         </w:tabs>
         <w:ind w:left="1440" w:hanging="360"/>
       </w:pPr>
+      <w:rPr>
+        <w:rFonts w:ascii="Courier New" w:hAnsi="Courier New" w:hint="default"/>
+        <w:sz w:val="20"/>
+      </w:rPr>
     </w:lvl>
     <w:lvl w:ilvl="2" w:tentative="1">
       <w:start w:val="1"/>
-      <w:numFmt w:val="decimal"/>
-      <w:lvlText w:val="%3."/>
+      <w:numFmt w:val="bullet"/>
+      <w:lvlText w:val=""/>
       <w:lvlJc w:val="left"/>
       <w:pPr>
         <w:tabs>
@@ -8204,11 +8232,15 @@
         </w:tabs>
         <w:ind w:left="2160" w:hanging="360"/>
       </w:pPr>
+      <w:rPr>
+        <w:rFonts w:ascii="Wingdings" w:hAnsi="Wingdings" w:hint="default"/>
+        <w:sz w:val="20"/>
+      </w:rPr>
     </w:lvl>
     <w:lvl w:ilvl="3" w:tentative="1">
       <w:start w:val="1"/>
-      <w:numFmt w:val="decimal"/>
-      <w:lvlText w:val="%4."/>
+      <w:numFmt w:val="bullet"/>
+      <w:lvlText w:val=""/>
       <w:lvlJc w:val="left"/>
       <w:pPr>
         <w:tabs>
@@ -8216,11 +8248,15 @@
         </w:tabs>
         <w:ind w:left="2880" w:hanging="360"/>
       </w:pPr>
+      <w:rPr>
+        <w:rFonts w:ascii="Wingdings" w:hAnsi="Wingdings" w:hint="default"/>
+        <w:sz w:val="20"/>
+      </w:rPr>
     </w:lvl>
     <w:lvl w:ilvl="4" w:tentative="1">
       <w:start w:val="1"/>
-      <w:numFmt w:val="decimal"/>
-      <w:lvlText w:val="%5."/>
+      <w:numFmt w:val="bullet"/>
+      <w:lvlText w:val=""/>
       <w:lvlJc w:val="left"/>
       <w:pPr>
         <w:tabs>
@@ -8228,11 +8264,15 @@
         </w:tabs>
         <w:ind w:left="3600" w:hanging="360"/>
       </w:pPr>
+      <w:rPr>
+        <w:rFonts w:ascii="Wingdings" w:hAnsi="Wingdings" w:hint="default"/>
+        <w:sz w:val="20"/>
+      </w:rPr>
     </w:lvl>
     <w:lvl w:ilvl="5" w:tentative="1">
       <w:start w:val="1"/>
-      <w:numFmt w:val="decimal"/>
-      <w:lvlText w:val="%6."/>
+      <w:numFmt w:val="bullet"/>
+      <w:lvlText w:val=""/>
       <w:lvlJc w:val="left"/>
       <w:pPr>
         <w:tabs>
@@ -8240,11 +8280,15 @@
         </w:tabs>
         <w:ind w:left="4320" w:hanging="360"/>
       </w:pPr>
+      <w:rPr>
+        <w:rFonts w:ascii="Wingdings" w:hAnsi="Wingdings" w:hint="default"/>
+        <w:sz w:val="20"/>
+      </w:rPr>
     </w:lvl>
     <w:lvl w:ilvl="6" w:tentative="1">
       <w:start w:val="1"/>
-      <w:numFmt w:val="decimal"/>
-      <w:lvlText w:val="%7."/>
+      <w:numFmt w:val="bullet"/>
+      <w:lvlText w:val=""/>
       <w:lvlJc w:val="left"/>
       <w:pPr>
         <w:tabs>
@@ -8252,11 +8296,15 @@
         </w:tabs>
         <w:ind w:left="5040" w:hanging="360"/>
       </w:pPr>
+      <w:rPr>
+        <w:rFonts w:ascii="Wingdings" w:hAnsi="Wingdings" w:hint="default"/>
+        <w:sz w:val="20"/>
+      </w:rPr>
     </w:lvl>
     <w:lvl w:ilvl="7" w:tentative="1">
       <w:start w:val="1"/>
-      <w:numFmt w:val="decimal"/>
-      <w:lvlText w:val="%8."/>
+      <w:numFmt w:val="bullet"/>
+      <w:lvlText w:val=""/>
       <w:lvlJc w:val="left"/>
       <w:pPr>
         <w:tabs>
@@ -8264,11 +8312,15 @@
         </w:tabs>
         <w:ind w:left="5760" w:hanging="360"/>
       </w:pPr>
+      <w:rPr>
+        <w:rFonts w:ascii="Wingdings" w:hAnsi="Wingdings" w:hint="default"/>
+        <w:sz w:val="20"/>
+      </w:rPr>
     </w:lvl>
     <w:lvl w:ilvl="8" w:tentative="1">
       <w:start w:val="1"/>
-      <w:numFmt w:val="decimal"/>
-      <w:lvlText w:val="%9."/>
+      <w:numFmt w:val="bullet"/>
+      <w:lvlText w:val=""/>
       <w:lvlJc w:val="left"/>
       <w:pPr>
         <w:tabs>
@@ -8276,16 +8328,20 @@
         </w:tabs>
         <w:ind w:left="6480" w:hanging="360"/>
       </w:pPr>
+      <w:rPr>
+        <w:rFonts w:ascii="Wingdings" w:hAnsi="Wingdings" w:hint="default"/>
+        <w:sz w:val="20"/>
+      </w:rPr>
     </w:lvl>
   </w:abstractNum>
   <w:abstractNum w:abstractNumId="29" w15:restartNumberingAfterBreak="0">
-    <w:nsid w:val="6D1D3CC5"/>
+    <w:nsid w:val="66884A7B"/>
     <w:multiLevelType w:val="multilevel"/>
-    <w:tmpl w:val="0AF6C61C"/>
+    <w:tmpl w:val="082032FE"/>
     <w:lvl w:ilvl="0">
       <w:start w:val="1"/>
-      <w:numFmt w:val="bullet"/>
-      <w:lvlText w:val=""/>
+      <w:numFmt w:val="decimal"/>
+      <w:lvlText w:val="%1."/>
       <w:lvlJc w:val="left"/>
       <w:pPr>
         <w:tabs>
@@ -8293,15 +8349,11 @@
         </w:tabs>
         <w:ind w:left="720" w:hanging="360"/>
       </w:pPr>
-      <w:rPr>
-        <w:rFonts w:ascii="Symbol" w:hAnsi="Symbol" w:hint="default"/>
-        <w:sz w:val="20"/>
-      </w:rPr>
     </w:lvl>
     <w:lvl w:ilvl="1" w:tentative="1">
       <w:start w:val="1"/>
-      <w:numFmt w:val="bullet"/>
-      <w:lvlText w:val="o"/>
+      <w:numFmt w:val="decimal"/>
+      <w:lvlText w:val="%2."/>
       <w:lvlJc w:val="left"/>
       <w:pPr>
         <w:tabs>
@@ -8309,15 +8361,11 @@
         </w:tabs>
         <w:ind w:left="1440" w:hanging="360"/>
       </w:pPr>
-      <w:rPr>
-        <w:rFonts w:ascii="Courier New" w:hAnsi="Courier New" w:hint="default"/>
-        <w:sz w:val="20"/>
-      </w:rPr>
     </w:lvl>
     <w:lvl w:ilvl="2" w:tentative="1">
       <w:start w:val="1"/>
-      <w:numFmt w:val="bullet"/>
-      <w:lvlText w:val=""/>
+      <w:numFmt w:val="decimal"/>
+      <w:lvlText w:val="%3."/>
       <w:lvlJc w:val="left"/>
       <w:pPr>
         <w:tabs>
@@ -8325,15 +8373,11 @@
         </w:tabs>
         <w:ind w:left="2160" w:hanging="360"/>
       </w:pPr>
-      <w:rPr>
-        <w:rFonts w:ascii="Wingdings" w:hAnsi="Wingdings" w:hint="default"/>
-        <w:sz w:val="20"/>
-      </w:rPr>
     </w:lvl>
     <w:lvl w:ilvl="3" w:tentative="1">
       <w:start w:val="1"/>
-      <w:numFmt w:val="bullet"/>
-      <w:lvlText w:val=""/>
+      <w:numFmt w:val="decimal"/>
+      <w:lvlText w:val="%4."/>
       <w:lvlJc w:val="left"/>
       <w:pPr>
         <w:tabs>
@@ -8341,15 +8385,11 @@
         </w:tabs>
         <w:ind w:left="2880" w:hanging="360"/>
       </w:pPr>
-      <w:rPr>
-        <w:rFonts w:ascii="Wingdings" w:hAnsi="Wingdings" w:hint="default"/>
-        <w:sz w:val="20"/>
-      </w:rPr>
     </w:lvl>
     <w:lvl w:ilvl="4" w:tentative="1">
       <w:start w:val="1"/>
-      <w:numFmt w:val="bullet"/>
-      <w:lvlText w:val=""/>
+      <w:numFmt w:val="decimal"/>
+      <w:lvlText w:val="%5."/>
       <w:lvlJc w:val="left"/>
       <w:pPr>
         <w:tabs>
@@ -8357,15 +8397,11 @@
         </w:tabs>
         <w:ind w:left="3600" w:hanging="360"/>
       </w:pPr>
-      <w:rPr>
-        <w:rFonts w:ascii="Wingdings" w:hAnsi="Wingdings" w:hint="default"/>
-        <w:sz w:val="20"/>
-      </w:rPr>
     </w:lvl>
     <w:lvl w:ilvl="5" w:tentative="1">
       <w:start w:val="1"/>
-      <w:numFmt w:val="bullet"/>
-      <w:lvlText w:val=""/>
+      <w:numFmt w:val="decimal"/>
+      <w:lvlText w:val="%6."/>
       <w:lvlJc w:val="left"/>
       <w:pPr>
         <w:tabs>
@@ -8373,15 +8409,11 @@
         </w:tabs>
         <w:ind w:left="4320" w:hanging="360"/>
       </w:pPr>
-      <w:rPr>
-        <w:rFonts w:ascii="Wingdings" w:hAnsi="Wingdings" w:hint="default"/>
-        <w:sz w:val="20"/>
-      </w:rPr>
     </w:lvl>
     <w:lvl w:ilvl="6" w:tentative="1">
       <w:start w:val="1"/>
-      <w:numFmt w:val="bullet"/>
-      <w:lvlText w:val=""/>
+      <w:numFmt w:val="decimal"/>
+      <w:lvlText w:val="%7."/>
       <w:lvlJc w:val="left"/>
       <w:pPr>
         <w:tabs>
@@ -8389,15 +8421,11 @@
         </w:tabs>
         <w:ind w:left="5040" w:hanging="360"/>
       </w:pPr>
-      <w:rPr>
-        <w:rFonts w:ascii="Wingdings" w:hAnsi="Wingdings" w:hint="default"/>
-        <w:sz w:val="20"/>
-      </w:rPr>
     </w:lvl>
     <w:lvl w:ilvl="7" w:tentative="1">
       <w:start w:val="1"/>
-      <w:numFmt w:val="bullet"/>
-      <w:lvlText w:val=""/>
+      <w:numFmt w:val="decimal"/>
+      <w:lvlText w:val="%8."/>
       <w:lvlJc w:val="left"/>
       <w:pPr>
         <w:tabs>
@@ -8405,15 +8433,11 @@
         </w:tabs>
         <w:ind w:left="5760" w:hanging="360"/>
       </w:pPr>
-      <w:rPr>
-        <w:rFonts w:ascii="Wingdings" w:hAnsi="Wingdings" w:hint="default"/>
-        <w:sz w:val="20"/>
-      </w:rPr>
     </w:lvl>
     <w:lvl w:ilvl="8" w:tentative="1">
       <w:start w:val="1"/>
-      <w:numFmt w:val="bullet"/>
-      <w:lvlText w:val=""/>
+      <w:numFmt w:val="decimal"/>
+      <w:lvlText w:val="%9."/>
       <w:lvlJc w:val="left"/>
       <w:pPr>
         <w:tabs>
@@ -8421,16 +8445,12 @@
         </w:tabs>
         <w:ind w:left="6480" w:hanging="360"/>
       </w:pPr>
-      <w:rPr>
-        <w:rFonts w:ascii="Wingdings" w:hAnsi="Wingdings" w:hint="default"/>
-        <w:sz w:val="20"/>
-      </w:rPr>
     </w:lvl>
   </w:abstractNum>
   <w:abstractNum w:abstractNumId="30" w15:restartNumberingAfterBreak="0">
-    <w:nsid w:val="6D855A04"/>
+    <w:nsid w:val="6C467698"/>
     <w:multiLevelType w:val="multilevel"/>
-    <w:tmpl w:val="04687686"/>
+    <w:tmpl w:val="C852883C"/>
     <w:lvl w:ilvl="0">
       <w:start w:val="1"/>
       <w:numFmt w:val="decimal"/>
@@ -8541,9 +8561,9 @@
     </w:lvl>
   </w:abstractNum>
   <w:abstractNum w:abstractNumId="31" w15:restartNumberingAfterBreak="0">
-    <w:nsid w:val="78BA58FA"/>
+    <w:nsid w:val="6C7E79F1"/>
     <w:multiLevelType w:val="multilevel"/>
-    <w:tmpl w:val="4CCC8EA8"/>
+    <w:tmpl w:val="BDBC52B2"/>
     <w:lvl w:ilvl="0">
       <w:start w:val="1"/>
       <w:numFmt w:val="decimal"/>
@@ -8654,9 +8674,9 @@
     </w:lvl>
   </w:abstractNum>
   <w:abstractNum w:abstractNumId="32" w15:restartNumberingAfterBreak="0">
-    <w:nsid w:val="7A0319E5"/>
+    <w:nsid w:val="7331647A"/>
     <w:multiLevelType w:val="multilevel"/>
-    <w:tmpl w:val="566A7DB4"/>
+    <w:tmpl w:val="F6CA558A"/>
     <w:lvl w:ilvl="0">
       <w:start w:val="1"/>
       <w:numFmt w:val="bullet"/>
@@ -8803,13 +8823,13 @@
     </w:lvl>
   </w:abstractNum>
   <w:abstractNum w:abstractNumId="33" w15:restartNumberingAfterBreak="0">
-    <w:nsid w:val="7B9E3A04"/>
+    <w:nsid w:val="77A70F6C"/>
     <w:multiLevelType w:val="multilevel"/>
-    <w:tmpl w:val="A4DAC93C"/>
+    <w:tmpl w:val="B9C8BBB8"/>
     <w:lvl w:ilvl="0">
       <w:start w:val="1"/>
-      <w:numFmt w:val="decimal"/>
-      <w:lvlText w:val="%1."/>
+      <w:numFmt w:val="bullet"/>
+      <w:lvlText w:val=""/>
       <w:lvlJc w:val="left"/>
       <w:pPr>
         <w:tabs>
@@ -8817,11 +8837,15 @@
         </w:tabs>
         <w:ind w:left="720" w:hanging="360"/>
       </w:pPr>
+      <w:rPr>
+        <w:rFonts w:ascii="Symbol" w:hAnsi="Symbol" w:hint="default"/>
+        <w:sz w:val="20"/>
+      </w:rPr>
     </w:lvl>
     <w:lvl w:ilvl="1" w:tentative="1">
       <w:start w:val="1"/>
-      <w:numFmt w:val="decimal"/>
-      <w:lvlText w:val="%2."/>
+      <w:numFmt w:val="bullet"/>
+      <w:lvlText w:val="o"/>
       <w:lvlJc w:val="left"/>
       <w:pPr>
         <w:tabs>
@@ -8829,11 +8853,15 @@
         </w:tabs>
         <w:ind w:left="1440" w:hanging="360"/>
       </w:pPr>
+      <w:rPr>
+        <w:rFonts w:ascii="Courier New" w:hAnsi="Courier New" w:hint="default"/>
+        <w:sz w:val="20"/>
+      </w:rPr>
     </w:lvl>
     <w:lvl w:ilvl="2" w:tentative="1">
       <w:start w:val="1"/>
-      <w:numFmt w:val="decimal"/>
-      <w:lvlText w:val="%3."/>
+      <w:numFmt w:val="bullet"/>
+      <w:lvlText w:val=""/>
       <w:lvlJc w:val="left"/>
       <w:pPr>
         <w:tabs>
@@ -8841,11 +8869,15 @@
         </w:tabs>
         <w:ind w:left="2160" w:hanging="360"/>
       </w:pPr>
+      <w:rPr>
+        <w:rFonts w:ascii="Wingdings" w:hAnsi="Wingdings" w:hint="default"/>
+        <w:sz w:val="20"/>
+      </w:rPr>
     </w:lvl>
     <w:lvl w:ilvl="3" w:tentative="1">
       <w:start w:val="1"/>
-      <w:numFmt w:val="decimal"/>
-      <w:lvlText w:val="%4."/>
+      <w:numFmt w:val="bullet"/>
+      <w:lvlText w:val=""/>
       <w:lvlJc w:val="left"/>
       <w:pPr>
         <w:tabs>
@@ -8853,11 +8885,15 @@
         </w:tabs>
         <w:ind w:left="2880" w:hanging="360"/>
       </w:pPr>
+      <w:rPr>
+        <w:rFonts w:ascii="Wingdings" w:hAnsi="Wingdings" w:hint="default"/>
+        <w:sz w:val="20"/>
+      </w:rPr>
     </w:lvl>
     <w:lvl w:ilvl="4" w:tentative="1">
       <w:start w:val="1"/>
-      <w:numFmt w:val="decimal"/>
-      <w:lvlText w:val="%5."/>
+      <w:numFmt w:val="bullet"/>
+      <w:lvlText w:val=""/>
       <w:lvlJc w:val="left"/>
       <w:pPr>
         <w:tabs>
@@ -8865,11 +8901,15 @@
         </w:tabs>
         <w:ind w:left="3600" w:hanging="360"/>
       </w:pPr>
+      <w:rPr>
+        <w:rFonts w:ascii="Wingdings" w:hAnsi="Wingdings" w:hint="default"/>
+        <w:sz w:val="20"/>
+      </w:rPr>
     </w:lvl>
     <w:lvl w:ilvl="5" w:tentative="1">
       <w:start w:val="1"/>
-      <w:numFmt w:val="decimal"/>
-      <w:lvlText w:val="%6."/>
+      <w:numFmt w:val="bullet"/>
+      <w:lvlText w:val=""/>
       <w:lvlJc w:val="left"/>
       <w:pPr>
         <w:tabs>
@@ -8877,11 +8917,15 @@
         </w:tabs>
         <w:ind w:left="4320" w:hanging="360"/>
       </w:pPr>
+      <w:rPr>
+        <w:rFonts w:ascii="Wingdings" w:hAnsi="Wingdings" w:hint="default"/>
+        <w:sz w:val="20"/>
+      </w:rPr>
     </w:lvl>
     <w:lvl w:ilvl="6" w:tentative="1">
       <w:start w:val="1"/>
-      <w:numFmt w:val="decimal"/>
-      <w:lvlText w:val="%7."/>
+      <w:numFmt w:val="bullet"/>
+      <w:lvlText w:val=""/>
       <w:lvlJc w:val="left"/>
       <w:pPr>
         <w:tabs>
@@ -8889,11 +8933,15 @@
         </w:tabs>
         <w:ind w:left="5040" w:hanging="360"/>
       </w:pPr>
+      <w:rPr>
+        <w:rFonts w:ascii="Wingdings" w:hAnsi="Wingdings" w:hint="default"/>
+        <w:sz w:val="20"/>
+      </w:rPr>
     </w:lvl>
     <w:lvl w:ilvl="7" w:tentative="1">
       <w:start w:val="1"/>
-      <w:numFmt w:val="decimal"/>
-      <w:lvlText w:val="%8."/>
+      <w:numFmt w:val="bullet"/>
+      <w:lvlText w:val=""/>
       <w:lvlJc w:val="left"/>
       <w:pPr>
         <w:tabs>
@@ -8901,11 +8949,15 @@
         </w:tabs>
         <w:ind w:left="5760" w:hanging="360"/>
       </w:pPr>
+      <w:rPr>
+        <w:rFonts w:ascii="Wingdings" w:hAnsi="Wingdings" w:hint="default"/>
+        <w:sz w:val="20"/>
+      </w:rPr>
     </w:lvl>
     <w:lvl w:ilvl="8" w:tentative="1">
       <w:start w:val="1"/>
-      <w:numFmt w:val="decimal"/>
-      <w:lvlText w:val="%9."/>
+      <w:numFmt w:val="bullet"/>
+      <w:lvlText w:val=""/>
       <w:lvlJc w:val="left"/>
       <w:pPr>
         <w:tabs>
@@ -8913,16 +8965,20 @@
         </w:tabs>
         <w:ind w:left="6480" w:hanging="360"/>
       </w:pPr>
+      <w:rPr>
+        <w:rFonts w:ascii="Wingdings" w:hAnsi="Wingdings" w:hint="default"/>
+        <w:sz w:val="20"/>
+      </w:rPr>
     </w:lvl>
   </w:abstractNum>
   <w:abstractNum w:abstractNumId="34" w15:restartNumberingAfterBreak="0">
-    <w:nsid w:val="7FE670D9"/>
+    <w:nsid w:val="791026A0"/>
     <w:multiLevelType w:val="multilevel"/>
-    <w:tmpl w:val="F3387470"/>
+    <w:tmpl w:val="2446F972"/>
     <w:lvl w:ilvl="0">
       <w:start w:val="1"/>
-      <w:numFmt w:val="bullet"/>
-      <w:lvlText w:val=""/>
+      <w:numFmt w:val="decimal"/>
+      <w:lvlText w:val="%1."/>
       <w:lvlJc w:val="left"/>
       <w:pPr>
         <w:tabs>
@@ -8930,15 +8986,11 @@
         </w:tabs>
         <w:ind w:left="720" w:hanging="360"/>
       </w:pPr>
-      <w:rPr>
-        <w:rFonts w:ascii="Symbol" w:hAnsi="Symbol" w:hint="default"/>
-        <w:sz w:val="20"/>
-      </w:rPr>
     </w:lvl>
     <w:lvl w:ilvl="1" w:tentative="1">
       <w:start w:val="1"/>
-      <w:numFmt w:val="bullet"/>
-      <w:lvlText w:val="o"/>
+      <w:numFmt w:val="decimal"/>
+      <w:lvlText w:val="%2."/>
       <w:lvlJc w:val="left"/>
       <w:pPr>
         <w:tabs>
@@ -8946,15 +8998,11 @@
         </w:tabs>
         <w:ind w:left="1440" w:hanging="360"/>
       </w:pPr>
-      <w:rPr>
-        <w:rFonts w:ascii="Courier New" w:hAnsi="Courier New" w:hint="default"/>
-        <w:sz w:val="20"/>
-      </w:rPr>
     </w:lvl>
     <w:lvl w:ilvl="2" w:tentative="1">
       <w:start w:val="1"/>
-      <w:numFmt w:val="bullet"/>
-      <w:lvlText w:val=""/>
+      <w:numFmt w:val="decimal"/>
+      <w:lvlText w:val="%3."/>
       <w:lvlJc w:val="left"/>
       <w:pPr>
         <w:tabs>
@@ -8962,15 +9010,11 @@
         </w:tabs>
         <w:ind w:left="2160" w:hanging="360"/>
       </w:pPr>
-      <w:rPr>
-        <w:rFonts w:ascii="Wingdings" w:hAnsi="Wingdings" w:hint="default"/>
-        <w:sz w:val="20"/>
-      </w:rPr>
     </w:lvl>
     <w:lvl w:ilvl="3" w:tentative="1">
       <w:start w:val="1"/>
-      <w:numFmt w:val="bullet"/>
-      <w:lvlText w:val=""/>
+      <w:numFmt w:val="decimal"/>
+      <w:lvlText w:val="%4."/>
       <w:lvlJc w:val="left"/>
       <w:pPr>
         <w:tabs>
@@ -8978,15 +9022,11 @@
         </w:tabs>
         <w:ind w:left="2880" w:hanging="360"/>
       </w:pPr>
-      <w:rPr>
-        <w:rFonts w:ascii="Wingdings" w:hAnsi="Wingdings" w:hint="default"/>
-        <w:sz w:val="20"/>
-      </w:rPr>
     </w:lvl>
     <w:lvl w:ilvl="4" w:tentative="1">
       <w:start w:val="1"/>
-      <w:numFmt w:val="bullet"/>
-      <w:lvlText w:val=""/>
+      <w:numFmt w:val="decimal"/>
+      <w:lvlText w:val="%5."/>
       <w:lvlJc w:val="left"/>
       <w:pPr>
         <w:tabs>
@@ -8994,15 +9034,11 @@
         </w:tabs>
         <w:ind w:left="3600" w:hanging="360"/>
       </w:pPr>
-      <w:rPr>
-        <w:rFonts w:ascii="Wingdings" w:hAnsi="Wingdings" w:hint="default"/>
-        <w:sz w:val="20"/>
-      </w:rPr>
     </w:lvl>
     <w:lvl w:ilvl="5" w:tentative="1">
       <w:start w:val="1"/>
-      <w:numFmt w:val="bullet"/>
-      <w:lvlText w:val=""/>
+      <w:numFmt w:val="decimal"/>
+      <w:lvlText w:val="%6."/>
       <w:lvlJc w:val="left"/>
       <w:pPr>
         <w:tabs>
@@ -9010,15 +9046,11 @@
         </w:tabs>
         <w:ind w:left="4320" w:hanging="360"/>
       </w:pPr>
-      <w:rPr>
-        <w:rFonts w:ascii="Wingdings" w:hAnsi="Wingdings" w:hint="default"/>
-        <w:sz w:val="20"/>
-      </w:rPr>
     </w:lvl>
     <w:lvl w:ilvl="6" w:tentative="1">
       <w:start w:val="1"/>
-      <w:numFmt w:val="bullet"/>
-      <w:lvlText w:val=""/>
+      <w:numFmt w:val="decimal"/>
+      <w:lvlText w:val="%7."/>
       <w:lvlJc w:val="left"/>
       <w:pPr>
         <w:tabs>
@@ -9026,15 +9058,11 @@
         </w:tabs>
         <w:ind w:left="5040" w:hanging="360"/>
       </w:pPr>
-      <w:rPr>
-        <w:rFonts w:ascii="Wingdings" w:hAnsi="Wingdings" w:hint="default"/>
-        <w:sz w:val="20"/>
-      </w:rPr>
     </w:lvl>
     <w:lvl w:ilvl="7" w:tentative="1">
       <w:start w:val="1"/>
-      <w:numFmt w:val="bullet"/>
-      <w:lvlText w:val=""/>
+      <w:numFmt w:val="decimal"/>
+      <w:lvlText w:val="%8."/>
       <w:lvlJc w:val="left"/>
       <w:pPr>
         <w:tabs>
@@ -9042,15 +9070,11 @@
         </w:tabs>
         <w:ind w:left="5760" w:hanging="360"/>
       </w:pPr>
-      <w:rPr>
-        <w:rFonts w:ascii="Wingdings" w:hAnsi="Wingdings" w:hint="default"/>
-        <w:sz w:val="20"/>
-      </w:rPr>
     </w:lvl>
     <w:lvl w:ilvl="8" w:tentative="1">
       <w:start w:val="1"/>
-      <w:numFmt w:val="bullet"/>
-      <w:lvlText w:val=""/>
+      <w:numFmt w:val="decimal"/>
+      <w:lvlText w:val="%9."/>
       <w:lvlJc w:val="left"/>
       <w:pPr>
         <w:tabs>
@@ -9058,116 +9082,112 @@
         </w:tabs>
         <w:ind w:left="6480" w:hanging="360"/>
       </w:pPr>
-      <w:rPr>
-        <w:rFonts w:ascii="Wingdings" w:hAnsi="Wingdings" w:hint="default"/>
-        <w:sz w:val="20"/>
-      </w:rPr>
     </w:lvl>
   </w:abstractNum>
-  <w:num w:numId="1" w16cid:durableId="1443184971">
+  <w:num w:numId="1" w16cid:durableId="1891183340">
+    <w:abstractNumId w:val="0"/>
+  </w:num>
+  <w:num w:numId="2" w16cid:durableId="1899591809">
+    <w:abstractNumId w:val="20"/>
+  </w:num>
+  <w:num w:numId="3" w16cid:durableId="817645330">
+    <w:abstractNumId w:val="21"/>
+  </w:num>
+  <w:num w:numId="4" w16cid:durableId="719936914">
+    <w:abstractNumId w:val="17"/>
+  </w:num>
+  <w:num w:numId="5" w16cid:durableId="901333479">
+    <w:abstractNumId w:val="1"/>
+  </w:num>
+  <w:num w:numId="6" w16cid:durableId="107285572">
     <w:abstractNumId w:val="33"/>
   </w:num>
-  <w:num w:numId="2" w16cid:durableId="178087305">
+  <w:num w:numId="7" w16cid:durableId="975842249">
+    <w:abstractNumId w:val="22"/>
+  </w:num>
+  <w:num w:numId="8" w16cid:durableId="1935938329">
+    <w:abstractNumId w:val="31"/>
+  </w:num>
+  <w:num w:numId="9" w16cid:durableId="126096954">
+    <w:abstractNumId w:val="30"/>
+  </w:num>
+  <w:num w:numId="10" w16cid:durableId="1622034868">
+    <w:abstractNumId w:val="26"/>
+  </w:num>
+  <w:num w:numId="11" w16cid:durableId="1304461271">
+    <w:abstractNumId w:val="15"/>
+  </w:num>
+  <w:num w:numId="12" w16cid:durableId="1988388357">
+    <w:abstractNumId w:val="10"/>
+  </w:num>
+  <w:num w:numId="13" w16cid:durableId="2136016944">
+    <w:abstractNumId w:val="8"/>
+  </w:num>
+  <w:num w:numId="14" w16cid:durableId="1355306585">
+    <w:abstractNumId w:val="18"/>
+  </w:num>
+  <w:num w:numId="15" w16cid:durableId="1612782577">
+    <w:abstractNumId w:val="27"/>
+  </w:num>
+  <w:num w:numId="16" w16cid:durableId="1725060582">
     <w:abstractNumId w:val="11"/>
   </w:num>
-  <w:num w:numId="3" w16cid:durableId="1958482182">
-    <w:abstractNumId w:val="0"/>
+  <w:num w:numId="17" w16cid:durableId="972752412">
+    <w:abstractNumId w:val="2"/>
   </w:num>
-  <w:num w:numId="4" w16cid:durableId="1172061665">
-    <w:abstractNumId w:val="17"/>
+  <w:num w:numId="18" w16cid:durableId="282738002">
+    <w:abstractNumId w:val="6"/>
   </w:num>
-  <w:num w:numId="5" w16cid:durableId="1990478083">
+  <w:num w:numId="19" w16cid:durableId="474029670">
+    <w:abstractNumId w:val="9"/>
+  </w:num>
+  <w:num w:numId="20" w16cid:durableId="377820250">
+    <w:abstractNumId w:val="28"/>
+  </w:num>
+  <w:num w:numId="21" w16cid:durableId="1322855899">
+    <w:abstractNumId w:val="29"/>
+  </w:num>
+  <w:num w:numId="22" w16cid:durableId="2025590447">
+    <w:abstractNumId w:val="25"/>
+  </w:num>
+  <w:num w:numId="23" w16cid:durableId="1232471799">
+    <w:abstractNumId w:val="3"/>
+  </w:num>
+  <w:num w:numId="24" w16cid:durableId="1256131430">
+    <w:abstractNumId w:val="23"/>
+  </w:num>
+  <w:num w:numId="25" w16cid:durableId="641426723">
+    <w:abstractNumId w:val="34"/>
+  </w:num>
+  <w:num w:numId="26" w16cid:durableId="133910918">
     <w:abstractNumId w:val="13"/>
   </w:num>
-  <w:num w:numId="6" w16cid:durableId="771823617">
-    <w:abstractNumId w:val="18"/>
+  <w:num w:numId="27" w16cid:durableId="835388451">
+    <w:abstractNumId w:val="16"/>
   </w:num>
-  <w:num w:numId="7" w16cid:durableId="864830223">
-    <w:abstractNumId w:val="9"/>
+  <w:num w:numId="28" w16cid:durableId="1866165108">
+    <w:abstractNumId w:val="24"/>
   </w:num>
-  <w:num w:numId="8" w16cid:durableId="1471436783">
+  <w:num w:numId="29" w16cid:durableId="1881084956">
+    <w:abstractNumId w:val="5"/>
+  </w:num>
+  <w:num w:numId="30" w16cid:durableId="123079749">
+    <w:abstractNumId w:val="14"/>
+  </w:num>
+  <w:num w:numId="31" w16cid:durableId="1873110096">
+    <w:abstractNumId w:val="32"/>
+  </w:num>
+  <w:num w:numId="32" w16cid:durableId="1044717083">
+    <w:abstractNumId w:val="4"/>
+  </w:num>
+  <w:num w:numId="33" w16cid:durableId="1910995117">
+    <w:abstractNumId w:val="7"/>
+  </w:num>
+  <w:num w:numId="34" w16cid:durableId="327906146">
     <w:abstractNumId w:val="19"/>
   </w:num>
-  <w:num w:numId="9" w16cid:durableId="878511236">
-    <w:abstractNumId w:val="14"/>
-  </w:num>
-  <w:num w:numId="10" w16cid:durableId="1211383714">
-    <w:abstractNumId w:val="30"/>
-  </w:num>
-  <w:num w:numId="11" w16cid:durableId="835268965">
-    <w:abstractNumId w:val="24"/>
-  </w:num>
-  <w:num w:numId="12" w16cid:durableId="1660766931">
-    <w:abstractNumId w:val="8"/>
-  </w:num>
-  <w:num w:numId="13" w16cid:durableId="894241231">
-    <w:abstractNumId w:val="15"/>
-  </w:num>
-  <w:num w:numId="14" w16cid:durableId="1083376107">
-    <w:abstractNumId w:val="5"/>
-  </w:num>
-  <w:num w:numId="15" w16cid:durableId="649943347">
-    <w:abstractNumId w:val="21"/>
-  </w:num>
-  <w:num w:numId="16" w16cid:durableId="1241210565">
-    <w:abstractNumId w:val="20"/>
-  </w:num>
-  <w:num w:numId="17" w16cid:durableId="1836262432">
-    <w:abstractNumId w:val="32"/>
-  </w:num>
-  <w:num w:numId="18" w16cid:durableId="1118330865">
-    <w:abstractNumId w:val="4"/>
-  </w:num>
-  <w:num w:numId="19" w16cid:durableId="957643331">
-    <w:abstractNumId w:val="25"/>
-  </w:num>
-  <w:num w:numId="20" w16cid:durableId="82337984">
+  <w:num w:numId="35" w16cid:durableId="550072346">
     <w:abstractNumId w:val="12"/>
-  </w:num>
-  <w:num w:numId="21" w16cid:durableId="1655336422">
-    <w:abstractNumId w:val="28"/>
-  </w:num>
-  <w:num w:numId="22" w16cid:durableId="1158695927">
-    <w:abstractNumId w:val="27"/>
-  </w:num>
-  <w:num w:numId="23" w16cid:durableId="437525689">
-    <w:abstractNumId w:val="6"/>
-  </w:num>
-  <w:num w:numId="24" w16cid:durableId="419182304">
-    <w:abstractNumId w:val="3"/>
-  </w:num>
-  <w:num w:numId="25" w16cid:durableId="2017464909">
-    <w:abstractNumId w:val="23"/>
-  </w:num>
-  <w:num w:numId="26" w16cid:durableId="1109086085">
-    <w:abstractNumId w:val="16"/>
-  </w:num>
-  <w:num w:numId="27" w16cid:durableId="1044058900">
-    <w:abstractNumId w:val="22"/>
-  </w:num>
-  <w:num w:numId="28" w16cid:durableId="1048604042">
-    <w:abstractNumId w:val="7"/>
-  </w:num>
-  <w:num w:numId="29" w16cid:durableId="1427924469">
-    <w:abstractNumId w:val="2"/>
-  </w:num>
-  <w:num w:numId="30" w16cid:durableId="1902402962">
-    <w:abstractNumId w:val="10"/>
-  </w:num>
-  <w:num w:numId="31" w16cid:durableId="758062160">
-    <w:abstractNumId w:val="34"/>
-  </w:num>
-  <w:num w:numId="32" w16cid:durableId="1546261007">
-    <w:abstractNumId w:val="29"/>
-  </w:num>
-  <w:num w:numId="33" w16cid:durableId="402025784">
-    <w:abstractNumId w:val="31"/>
-  </w:num>
-  <w:num w:numId="34" w16cid:durableId="1701930237">
-    <w:abstractNumId w:val="26"/>
-  </w:num>
-  <w:num w:numId="35" w16cid:durableId="1101678964">
-    <w:abstractNumId w:val="1"/>
   </w:num>
 </w:numbering>
 </file>

</xml_diff>